<commit_message>
imagenes bombas, atencion_clientes y bardas, actualizacion GRI y MF
</commit_message>
<xml_diff>
--- a/Inputs/Templates/MF Cidur.docx
+++ b/Inputs/Templates/MF Cidur.docx
@@ -42,26 +42,15 @@
           <w:rFonts w:cstheme="minorHAnsi"/>
           <w:color w:val="000000" w:themeColor="text1"/>
         </w:rPr>
-        <w:t xml:space="preserve">Riesgos internos y circundantes. </w:t>
+        <w:t>El inmueble</w:t>
       </w:r>
-    </w:p>
-    <w:p>
-      <w:pPr>
-        <w:spacing w:line="360" w:lineRule="auto"/>
-        <w:jc w:val="both"/>
-        <w:rPr>
-          <w:rFonts w:cstheme="minorHAnsi"/>
-          <w:color w:val="000000" w:themeColor="text1"/>
-        </w:rPr>
-      </w:pPr>
       <w:r>
         <w:rPr>
           <w:rFonts w:cstheme="minorHAnsi"/>
           <w:color w:val="000000" w:themeColor="text1"/>
         </w:rPr>
-        <w:t xml:space="preserve">La sucursal </w:t>
+        <w:t xml:space="preserve"> </w:t>
       </w:r>
-      <w:proofErr w:type="gramStart"/>
       <w:r>
         <w:rPr>
           <w:rFonts w:cstheme="minorHAnsi"/>
@@ -77,16 +66,7 @@
           <w:b/>
           <w:color w:val="000000" w:themeColor="text1"/>
         </w:rPr>
-        <w:t>razon</w:t>
-      </w:r>
-      <w:proofErr w:type="gramEnd"/>
-      <w:r>
-        <w:rPr>
-          <w:rFonts w:cstheme="minorHAnsi"/>
-          <w:b/>
-          <w:color w:val="000000" w:themeColor="text1"/>
-        </w:rPr>
-        <w:t>_social</w:t>
+        <w:t>razon_social</w:t>
       </w:r>
       <w:proofErr w:type="spellEnd"/>
       <w:r>
@@ -152,7 +132,21 @@
           <w:rFonts w:cstheme="minorHAnsi"/>
           <w:color w:val="000000" w:themeColor="text1"/>
         </w:rPr>
-        <w:t>se ubica frente a una vialidad altamente transitada, colinda con otros inmuebles de servicios con giro comercial.</w:t>
+        <w:t xml:space="preserve">se ubica </w:t>
+      </w:r>
+      <w:r>
+        <w:rPr>
+          <w:rFonts w:cstheme="minorHAnsi"/>
+          <w:color w:val="000000" w:themeColor="text1"/>
+        </w:rPr>
+        <w:t>al sur de {{ norte }}, al norte de {{ sur }}, al este de {{ oeste }} y al oeste de {{ este }}</w:t>
+      </w:r>
+      <w:r>
+        <w:rPr>
+          <w:rFonts w:cstheme="minorHAnsi"/>
+          <w:color w:val="000000" w:themeColor="text1"/>
+        </w:rPr>
+        <w:t>.</w:t>
       </w:r>
       <w:r>
         <w:rPr>
@@ -182,9 +176,8 @@
           <w:rFonts w:cstheme="minorHAnsi"/>
           <w:color w:val="000000" w:themeColor="text1"/>
         </w:rPr>
-        <w:t xml:space="preserve">El horario de atención de servicios es de </w:t>
+        <w:t xml:space="preserve">El horario de atención es de </w:t>
       </w:r>
-      <w:proofErr w:type="gramStart"/>
       <w:r>
         <w:rPr>
           <w:rFonts w:cstheme="minorHAnsi"/>
@@ -201,7 +194,6 @@
         <w:t>dias</w:t>
       </w:r>
       <w:proofErr w:type="spellEnd"/>
-      <w:proofErr w:type="gramEnd"/>
       <w:r>
         <w:rPr>
           <w:rFonts w:cstheme="minorHAnsi"/>
@@ -230,19 +222,6 @@
         </w:rPr>
         <w:t>.</w:t>
       </w:r>
-      <w:r>
-        <w:rPr>
-          <w:rFonts w:eastAsia="Times New Roman" w:cstheme="minorHAnsi"/>
-          <w:snapToGrid w:val="0"/>
-          <w:color w:val="000000" w:themeColor="text1"/>
-          <w:w w:val="0"/>
-          <w:u w:color="000000"/>
-          <w:bdr w:val="none" w:sz="0" w:space="0" w:color="000000"/>
-          <w:shd w:val="clear" w:color="000000" w:fill="000000"/>
-          <w:lang w:eastAsia="x-none" w:bidi="x-none"/>
-        </w:rPr>
-        <w:t xml:space="preserve">   </w:t>
-      </w:r>
     </w:p>
     <w:p>
       <w:pPr>
@@ -260,21 +239,12 @@
         </w:rPr>
         <w:t xml:space="preserve"> Cuenta con </w:t>
       </w:r>
-      <w:proofErr w:type="gramStart"/>
       <w:r>
         <w:rPr>
           <w:rFonts w:cstheme="minorHAnsi"/>
           <w:color w:val="000000" w:themeColor="text1"/>
         </w:rPr>
-        <w:t>{{ trabajadores</w:t>
-      </w:r>
-      <w:proofErr w:type="gramEnd"/>
-      <w:r>
-        <w:rPr>
-          <w:rFonts w:cstheme="minorHAnsi"/>
-          <w:color w:val="000000" w:themeColor="text1"/>
-        </w:rPr>
-        <w:t xml:space="preserve"> }}</w:t>
+        <w:t>{{ trabajadores }}</w:t>
       </w:r>
       <w:r>
         <w:rPr>
@@ -352,6 +322,9 @@
         <w:gridCol w:w="4414"/>
       </w:tblGrid>
       <w:tr>
+        <w:trPr>
+          <w:trHeight w:val="3288"/>
+        </w:trPr>
         <w:tc>
           <w:tcPr>
             <w:tcW w:w="4414" w:type="dxa"/>
@@ -361,6 +334,7 @@
             <w:pPr>
               <w:pStyle w:val="Default"/>
               <w:spacing w:line="360" w:lineRule="auto"/>
+              <w:jc w:val="both"/>
               <w:rPr>
                 <w:rFonts w:asciiTheme="minorHAnsi" w:hAnsiTheme="minorHAnsi" w:cstheme="minorHAnsi"/>
                 <w:color w:val="000000" w:themeColor="text1"/>
@@ -396,7 +370,6 @@
                 <w:szCs w:val="22"/>
               </w:rPr>
             </w:pPr>
-            <w:proofErr w:type="gramStart"/>
             <w:r>
               <w:rPr>
                 <w:rFonts w:asciiTheme="minorHAnsi" w:hAnsiTheme="minorHAnsi" w:cstheme="minorHAnsi"/>
@@ -404,22 +377,56 @@
                 <w:sz w:val="22"/>
                 <w:szCs w:val="22"/>
               </w:rPr>
-              <w:t>{{ mueble</w:t>
-            </w:r>
-            <w:proofErr w:type="gramEnd"/>
-            <w:r>
-              <w:rPr>
-                <w:rFonts w:asciiTheme="minorHAnsi" w:hAnsiTheme="minorHAnsi" w:cstheme="minorHAnsi"/>
-                <w:color w:val="000000" w:themeColor="text1"/>
-                <w:sz w:val="22"/>
-                <w:szCs w:val="22"/>
-              </w:rPr>
-              <w:t>1 }}</w:t>
+              <w:t>{{ mueble1 }}</w:t>
             </w:r>
           </w:p>
         </w:tc>
       </w:tr>
       <w:tr>
+        <w:trPr>
+          <w:trHeight w:val="57"/>
+        </w:trPr>
+        <w:tc>
+          <w:tcPr>
+            <w:tcW w:w="4414" w:type="dxa"/>
+            <w:vAlign w:val="center"/>
+          </w:tcPr>
+          <w:p>
+            <w:pPr>
+              <w:pStyle w:val="Default"/>
+              <w:jc w:val="both"/>
+              <w:rPr>
+                <w:rFonts w:asciiTheme="minorHAnsi" w:hAnsiTheme="minorHAnsi" w:cstheme="minorHAnsi"/>
+                <w:color w:val="000000" w:themeColor="text1"/>
+                <w:sz w:val="20"/>
+                <w:szCs w:val="20"/>
+              </w:rPr>
+            </w:pPr>
+          </w:p>
+        </w:tc>
+        <w:tc>
+          <w:tcPr>
+            <w:tcW w:w="4414" w:type="dxa"/>
+            <w:vAlign w:val="center"/>
+          </w:tcPr>
+          <w:p>
+            <w:pPr>
+              <w:pStyle w:val="Default"/>
+              <w:jc w:val="center"/>
+              <w:rPr>
+                <w:rFonts w:asciiTheme="minorHAnsi" w:hAnsiTheme="minorHAnsi" w:cstheme="minorHAnsi"/>
+                <w:color w:val="000000" w:themeColor="text1"/>
+                <w:sz w:val="20"/>
+                <w:szCs w:val="20"/>
+              </w:rPr>
+            </w:pPr>
+          </w:p>
+        </w:tc>
+      </w:tr>
+      <w:tr>
+        <w:trPr>
+          <w:trHeight w:val="3288"/>
+        </w:trPr>
         <w:tc>
           <w:tcPr>
             <w:tcW w:w="4414" w:type="dxa"/>
@@ -429,6 +436,7 @@
             <w:pPr>
               <w:pStyle w:val="Default"/>
               <w:spacing w:line="360" w:lineRule="auto"/>
+              <w:jc w:val="both"/>
               <w:rPr>
                 <w:rFonts w:asciiTheme="minorHAnsi" w:hAnsiTheme="minorHAnsi" w:cstheme="minorHAnsi"/>
                 <w:color w:val="000000" w:themeColor="text1"/>
@@ -464,7 +472,6 @@
                 <w:szCs w:val="22"/>
               </w:rPr>
             </w:pPr>
-            <w:proofErr w:type="gramStart"/>
             <w:r>
               <w:rPr>
                 <w:rFonts w:asciiTheme="minorHAnsi" w:hAnsiTheme="minorHAnsi" w:cstheme="minorHAnsi"/>
@@ -474,7 +481,6 @@
               </w:rPr>
               <w:t>{{ ruta</w:t>
             </w:r>
-            <w:proofErr w:type="gramEnd"/>
             <w:r>
               <w:rPr>
                 <w:rFonts w:asciiTheme="minorHAnsi" w:hAnsiTheme="minorHAnsi" w:cstheme="minorHAnsi"/>
@@ -482,7 +488,371 @@
                 <w:sz w:val="22"/>
                 <w:szCs w:val="22"/>
               </w:rPr>
-              <w:t>2 }}</w:t>
+              <w:t>1</w:t>
+            </w:r>
+            <w:r>
+              <w:rPr>
+                <w:rFonts w:asciiTheme="minorHAnsi" w:hAnsiTheme="minorHAnsi" w:cstheme="minorHAnsi"/>
+                <w:color w:val="000000" w:themeColor="text1"/>
+                <w:sz w:val="22"/>
+                <w:szCs w:val="22"/>
+              </w:rPr>
+              <w:t xml:space="preserve"> }}</w:t>
+            </w:r>
+          </w:p>
+        </w:tc>
+      </w:tr>
+    </w:tbl>
+    <w:p>
+      <w:pPr>
+        <w:rPr>
+          <w:rFonts w:cstheme="minorHAnsi"/>
+          <w:color w:val="000000" w:themeColor="text1"/>
+        </w:rPr>
+      </w:pPr>
+      <w:r>
+        <w:rPr>
+          <w:rFonts w:cstheme="minorHAnsi"/>
+          <w:color w:val="000000" w:themeColor="text1"/>
+        </w:rPr>
+        <w:br w:type="page"/>
+      </w:r>
+    </w:p>
+    <w:p>
+      <w:pPr>
+        <w:rPr>
+          <w:rFonts w:cstheme="minorHAnsi"/>
+          <w:color w:val="000000" w:themeColor="text1"/>
+        </w:rPr>
+      </w:pPr>
+    </w:p>
+    <w:tbl>
+      <w:tblPr>
+        <w:tblStyle w:val="Tablaconcuadrcula"/>
+        <w:tblW w:w="0" w:type="auto"/>
+        <w:tblInd w:w="-5" w:type="dxa"/>
+        <w:tblBorders>
+          <w:top w:val="none" w:sz="0" w:space="0" w:color="auto"/>
+          <w:left w:val="none" w:sz="0" w:space="0" w:color="auto"/>
+          <w:bottom w:val="none" w:sz="0" w:space="0" w:color="auto"/>
+          <w:right w:val="none" w:sz="0" w:space="0" w:color="auto"/>
+          <w:insideH w:val="none" w:sz="0" w:space="0" w:color="auto"/>
+          <w:insideV w:val="none" w:sz="0" w:space="0" w:color="auto"/>
+        </w:tblBorders>
+        <w:tblLook w:val="04A0" w:firstRow="1" w:lastRow="0" w:firstColumn="1" w:lastColumn="0" w:noHBand="0" w:noVBand="1"/>
+      </w:tblPr>
+      <w:tblGrid>
+        <w:gridCol w:w="4416"/>
+        <w:gridCol w:w="4417"/>
+      </w:tblGrid>
+      <w:tr>
+        <w:tc>
+          <w:tcPr>
+            <w:tcW w:w="8833" w:type="dxa"/>
+            <w:gridSpan w:val="2"/>
+            <w:vAlign w:val="center"/>
+          </w:tcPr>
+          <w:p>
+            <w:pPr>
+              <w:pStyle w:val="Default"/>
+              <w:spacing w:line="360" w:lineRule="auto"/>
+              <w:rPr>
+                <w:rFonts w:asciiTheme="minorHAnsi" w:hAnsiTheme="minorHAnsi" w:cstheme="minorHAnsi"/>
+                <w:color w:val="000000" w:themeColor="text1"/>
+                <w:sz w:val="22"/>
+                <w:szCs w:val="22"/>
+              </w:rPr>
+            </w:pPr>
+            <w:r>
+              <w:rPr>
+                <w:rFonts w:asciiTheme="minorHAnsi" w:hAnsiTheme="minorHAnsi" w:cstheme="minorHAnsi"/>
+                <w:color w:val="000000" w:themeColor="text1"/>
+                <w:sz w:val="22"/>
+                <w:szCs w:val="22"/>
+              </w:rPr>
+              <w:t>La cantidad de equipos contra incendio se encuentran vigentes.  Se recomienda mantener a 1.50 metros y libres de obstáculos, previa señalamiento informativo</w:t>
+            </w:r>
+            <w:r>
+              <w:rPr>
+                <w:rFonts w:asciiTheme="minorHAnsi" w:hAnsiTheme="minorHAnsi" w:cstheme="minorHAnsi"/>
+                <w:color w:val="000000" w:themeColor="text1"/>
+                <w:sz w:val="22"/>
+                <w:szCs w:val="22"/>
+              </w:rPr>
+              <w:t>.</w:t>
+            </w:r>
+          </w:p>
+        </w:tc>
+      </w:tr>
+      <w:tr>
+        <w:trPr>
+          <w:trHeight w:val="3888"/>
+        </w:trPr>
+        <w:tc>
+          <w:tcPr>
+            <w:tcW w:w="4416" w:type="dxa"/>
+            <w:vAlign w:val="center"/>
+          </w:tcPr>
+          <w:p>
+            <w:pPr>
+              <w:pStyle w:val="Default"/>
+              <w:spacing w:line="360" w:lineRule="auto"/>
+              <w:jc w:val="center"/>
+              <w:rPr>
+                <w:rFonts w:asciiTheme="minorHAnsi" w:hAnsiTheme="minorHAnsi" w:cstheme="minorHAnsi"/>
+                <w:color w:val="000000" w:themeColor="text1"/>
+                <w:sz w:val="22"/>
+                <w:szCs w:val="22"/>
+              </w:rPr>
+            </w:pPr>
+            <w:r>
+              <w:rPr>
+                <w:rFonts w:asciiTheme="minorHAnsi" w:hAnsiTheme="minorHAnsi" w:cstheme="minorHAnsi"/>
+                <w:color w:val="000000" w:themeColor="text1"/>
+                <w:sz w:val="22"/>
+                <w:szCs w:val="22"/>
+              </w:rPr>
+              <w:t>{{ ext1 }}</w:t>
+            </w:r>
+          </w:p>
+        </w:tc>
+        <w:tc>
+          <w:tcPr>
+            <w:tcW w:w="4417" w:type="dxa"/>
+            <w:vAlign w:val="center"/>
+          </w:tcPr>
+          <w:p>
+            <w:pPr>
+              <w:pStyle w:val="Default"/>
+              <w:spacing w:line="360" w:lineRule="auto"/>
+              <w:jc w:val="center"/>
+              <w:rPr>
+                <w:rFonts w:asciiTheme="minorHAnsi" w:hAnsiTheme="minorHAnsi" w:cstheme="minorHAnsi"/>
+                <w:color w:val="000000" w:themeColor="text1"/>
+                <w:sz w:val="22"/>
+                <w:szCs w:val="22"/>
+              </w:rPr>
+            </w:pPr>
+            <w:r>
+              <w:rPr>
+                <w:rFonts w:asciiTheme="minorHAnsi" w:hAnsiTheme="minorHAnsi" w:cstheme="minorHAnsi"/>
+                <w:color w:val="000000" w:themeColor="text1"/>
+                <w:sz w:val="22"/>
+                <w:szCs w:val="22"/>
+              </w:rPr>
+              <w:t>{{ ext</w:t>
+            </w:r>
+            <w:r>
+              <w:rPr>
+                <w:rFonts w:asciiTheme="minorHAnsi" w:hAnsiTheme="minorHAnsi" w:cstheme="minorHAnsi"/>
+                <w:color w:val="000000" w:themeColor="text1"/>
+                <w:sz w:val="22"/>
+                <w:szCs w:val="22"/>
+              </w:rPr>
+              <w:t>2</w:t>
+            </w:r>
+            <w:r>
+              <w:rPr>
+                <w:rFonts w:asciiTheme="minorHAnsi" w:hAnsiTheme="minorHAnsi" w:cstheme="minorHAnsi"/>
+                <w:color w:val="000000" w:themeColor="text1"/>
+                <w:sz w:val="22"/>
+                <w:szCs w:val="22"/>
+              </w:rPr>
+              <w:t xml:space="preserve"> }}</w:t>
+            </w:r>
+          </w:p>
+        </w:tc>
+      </w:tr>
+      <w:tr>
+        <w:trPr>
+          <w:trHeight w:val="3288"/>
+        </w:trPr>
+        <w:tc>
+          <w:tcPr>
+            <w:tcW w:w="4416" w:type="dxa"/>
+            <w:vAlign w:val="center"/>
+          </w:tcPr>
+          <w:p>
+            <w:pPr>
+              <w:pStyle w:val="Default"/>
+              <w:spacing w:line="360" w:lineRule="auto"/>
+              <w:jc w:val="both"/>
+              <w:rPr>
+                <w:rFonts w:asciiTheme="minorHAnsi" w:hAnsiTheme="minorHAnsi" w:cstheme="minorHAnsi"/>
+                <w:color w:val="000000" w:themeColor="text1"/>
+                <w:sz w:val="22"/>
+                <w:szCs w:val="22"/>
+              </w:rPr>
+            </w:pPr>
+            <w:r>
+              <w:rPr>
+                <w:rFonts w:asciiTheme="minorHAnsi" w:hAnsiTheme="minorHAnsi" w:cstheme="minorHAnsi"/>
+                <w:color w:val="000000" w:themeColor="text1"/>
+                <w:sz w:val="22"/>
+                <w:szCs w:val="22"/>
+              </w:rPr>
+              <w:t>Cuenta con mantenimiento a techo, lozas y azotea debe registrarse en bitácora, dando evidencia de limpieza en bajadas pluviales, aplicación de impermeabilizante, mantenimiento preventivo y correctivo</w:t>
+            </w:r>
+            <w:r>
+              <w:rPr>
+                <w:rFonts w:asciiTheme="minorHAnsi" w:hAnsiTheme="minorHAnsi" w:cstheme="minorHAnsi"/>
+                <w:noProof/>
+                <w:color w:val="000000" w:themeColor="text1"/>
+                <w:sz w:val="22"/>
+                <w:szCs w:val="22"/>
+                <w:lang w:eastAsia="es-MX"/>
+              </w:rPr>
+              <w:t>.  En techo cuenta con iluminación tipo LED y ahorradores de energía.</w:t>
+            </w:r>
+          </w:p>
+        </w:tc>
+        <w:tc>
+          <w:tcPr>
+            <w:tcW w:w="4417" w:type="dxa"/>
+            <w:vAlign w:val="center"/>
+          </w:tcPr>
+          <w:p>
+            <w:pPr>
+              <w:pStyle w:val="Default"/>
+              <w:spacing w:line="360" w:lineRule="auto"/>
+              <w:jc w:val="center"/>
+              <w:rPr>
+                <w:rFonts w:asciiTheme="minorHAnsi" w:hAnsiTheme="minorHAnsi" w:cstheme="minorHAnsi"/>
+                <w:color w:val="000000" w:themeColor="text1"/>
+                <w:sz w:val="22"/>
+                <w:szCs w:val="22"/>
+              </w:rPr>
+            </w:pPr>
+            <w:r>
+              <w:rPr>
+                <w:rFonts w:asciiTheme="minorHAnsi" w:hAnsiTheme="minorHAnsi" w:cstheme="minorHAnsi"/>
+                <w:color w:val="000000" w:themeColor="text1"/>
+                <w:sz w:val="22"/>
+                <w:szCs w:val="22"/>
+              </w:rPr>
+              <w:t>{{ techo }}</w:t>
+            </w:r>
+          </w:p>
+        </w:tc>
+      </w:tr>
+      <w:tr>
+        <w:trPr>
+          <w:trHeight w:val="57"/>
+        </w:trPr>
+        <w:tc>
+          <w:tcPr>
+            <w:tcW w:w="4416" w:type="dxa"/>
+            <w:vAlign w:val="center"/>
+          </w:tcPr>
+          <w:p>
+            <w:pPr>
+              <w:pStyle w:val="Default"/>
+              <w:jc w:val="both"/>
+              <w:rPr>
+                <w:rFonts w:asciiTheme="minorHAnsi" w:hAnsiTheme="minorHAnsi" w:cstheme="minorHAnsi"/>
+                <w:color w:val="000000" w:themeColor="text1"/>
+                <w:sz w:val="20"/>
+                <w:szCs w:val="20"/>
+              </w:rPr>
+            </w:pPr>
+          </w:p>
+        </w:tc>
+        <w:tc>
+          <w:tcPr>
+            <w:tcW w:w="4417" w:type="dxa"/>
+            <w:vAlign w:val="center"/>
+          </w:tcPr>
+          <w:p>
+            <w:pPr>
+              <w:pStyle w:val="Default"/>
+              <w:jc w:val="center"/>
+              <w:rPr>
+                <w:rFonts w:asciiTheme="minorHAnsi" w:hAnsiTheme="minorHAnsi" w:cstheme="minorHAnsi"/>
+                <w:color w:val="000000" w:themeColor="text1"/>
+                <w:sz w:val="20"/>
+                <w:szCs w:val="20"/>
+              </w:rPr>
+            </w:pPr>
+          </w:p>
+        </w:tc>
+      </w:tr>
+      <w:tr>
+        <w:trPr>
+          <w:trHeight w:val="3288"/>
+        </w:trPr>
+        <w:tc>
+          <w:tcPr>
+            <w:tcW w:w="4416" w:type="dxa"/>
+            <w:vAlign w:val="center"/>
+          </w:tcPr>
+          <w:p>
+            <w:pPr>
+              <w:pStyle w:val="Default"/>
+              <w:spacing w:line="360" w:lineRule="auto"/>
+              <w:jc w:val="both"/>
+              <w:rPr>
+                <w:rFonts w:asciiTheme="minorHAnsi" w:hAnsiTheme="minorHAnsi" w:cstheme="minorHAnsi"/>
+                <w:color w:val="000000" w:themeColor="text1"/>
+                <w:sz w:val="22"/>
+                <w:szCs w:val="22"/>
+              </w:rPr>
+            </w:pPr>
+            <w:r>
+              <w:rPr>
+                <w:rFonts w:asciiTheme="minorHAnsi" w:hAnsiTheme="minorHAnsi" w:cstheme="minorHAnsi"/>
+                <w:color w:val="000000" w:themeColor="text1"/>
+                <w:sz w:val="22"/>
+                <w:szCs w:val="22"/>
+              </w:rPr>
+              <w:t>No cuenta con instalación de gas LP.</w:t>
+            </w:r>
+          </w:p>
+        </w:tc>
+        <w:tc>
+          <w:tcPr>
+            <w:tcW w:w="4417" w:type="dxa"/>
+            <w:vAlign w:val="center"/>
+          </w:tcPr>
+          <w:p>
+            <w:pPr>
+              <w:pStyle w:val="Default"/>
+              <w:spacing w:line="360" w:lineRule="auto"/>
+              <w:jc w:val="center"/>
+              <w:rPr>
+                <w:rFonts w:asciiTheme="minorHAnsi" w:hAnsiTheme="minorHAnsi" w:cstheme="minorHAnsi"/>
+                <w:color w:val="000000" w:themeColor="text1"/>
+                <w:sz w:val="22"/>
+                <w:szCs w:val="22"/>
+              </w:rPr>
+            </w:pPr>
+            <w:r>
+              <w:rPr>
+                <w:rFonts w:asciiTheme="minorHAnsi" w:hAnsiTheme="minorHAnsi" w:cstheme="minorHAnsi"/>
+                <w:color w:val="000000" w:themeColor="text1"/>
+                <w:sz w:val="22"/>
+                <w:szCs w:val="22"/>
+              </w:rPr>
+              <w:t xml:space="preserve">{{ </w:t>
+            </w:r>
+            <w:proofErr w:type="spellStart"/>
+            <w:r>
+              <w:rPr>
+                <w:rFonts w:asciiTheme="minorHAnsi" w:hAnsiTheme="minorHAnsi" w:cstheme="minorHAnsi"/>
+                <w:color w:val="000000" w:themeColor="text1"/>
+                <w:sz w:val="22"/>
+                <w:szCs w:val="22"/>
+              </w:rPr>
+              <w:t>tanques_gaso</w:t>
+            </w:r>
+            <w:proofErr w:type="spellEnd"/>
+            <w:r>
+              <w:rPr>
+                <w:rFonts w:asciiTheme="minorHAnsi" w:hAnsiTheme="minorHAnsi" w:cstheme="minorHAnsi"/>
+                <w:color w:val="000000" w:themeColor="text1"/>
+                <w:sz w:val="22"/>
+                <w:szCs w:val="22"/>
+              </w:rPr>
+              <w:t xml:space="preserve"> }}</w:t>
             </w:r>
           </w:p>
         </w:tc>
@@ -529,231 +899,16 @@
         <w:tblLook w:val="04A0" w:firstRow="1" w:lastRow="0" w:firstColumn="1" w:lastColumn="0" w:noHBand="0" w:noVBand="1"/>
       </w:tblPr>
       <w:tblGrid>
-        <w:gridCol w:w="4395"/>
-        <w:gridCol w:w="4438"/>
+        <w:gridCol w:w="2977"/>
+        <w:gridCol w:w="2717"/>
+        <w:gridCol w:w="451"/>
+        <w:gridCol w:w="2688"/>
       </w:tblGrid>
       <w:tr>
         <w:tc>
           <w:tcPr>
             <w:tcW w:w="8833" w:type="dxa"/>
-            <w:gridSpan w:val="2"/>
-            <w:vAlign w:val="center"/>
-          </w:tcPr>
-          <w:p>
-            <w:pPr>
-              <w:pStyle w:val="Default"/>
-              <w:spacing w:line="360" w:lineRule="auto"/>
-              <w:rPr>
-                <w:rFonts w:asciiTheme="minorHAnsi" w:hAnsiTheme="minorHAnsi" w:cstheme="minorHAnsi"/>
-                <w:color w:val="000000" w:themeColor="text1"/>
-                <w:sz w:val="22"/>
-                <w:szCs w:val="22"/>
-              </w:rPr>
-            </w:pPr>
-            <w:r>
-              <w:rPr>
-                <w:rFonts w:asciiTheme="minorHAnsi" w:hAnsiTheme="minorHAnsi" w:cstheme="minorHAnsi"/>
-                <w:color w:val="000000" w:themeColor="text1"/>
-                <w:sz w:val="22"/>
-                <w:szCs w:val="22"/>
-              </w:rPr>
-              <w:t>La cantidad de equipos contra incendio se encuentran vigentes.  Se recomienda mantener a 1.50 metros y libres de obstáculos, previa señalamiento informativo</w:t>
-            </w:r>
-            <w:r>
-              <w:rPr>
-                <w:rFonts w:asciiTheme="minorHAnsi" w:hAnsiTheme="minorHAnsi" w:cstheme="minorHAnsi"/>
-                <w:color w:val="000000" w:themeColor="text1"/>
-                <w:sz w:val="22"/>
-                <w:szCs w:val="22"/>
-              </w:rPr>
-              <w:t>.</w:t>
-            </w:r>
-          </w:p>
-        </w:tc>
-      </w:tr>
-      <w:tr>
-        <w:trPr>
-          <w:trHeight w:val="4703"/>
-        </w:trPr>
-        <w:tc>
-          <w:tcPr>
-            <w:tcW w:w="4395" w:type="dxa"/>
-            <w:vAlign w:val="center"/>
-          </w:tcPr>
-          <w:p>
-            <w:pPr>
-              <w:pStyle w:val="Default"/>
-              <w:spacing w:line="360" w:lineRule="auto"/>
-              <w:jc w:val="center"/>
-              <w:rPr>
-                <w:rFonts w:asciiTheme="minorHAnsi" w:hAnsiTheme="minorHAnsi" w:cstheme="minorHAnsi"/>
-                <w:color w:val="000000" w:themeColor="text1"/>
-                <w:sz w:val="22"/>
-                <w:szCs w:val="22"/>
-              </w:rPr>
-            </w:pPr>
-            <w:proofErr w:type="gramStart"/>
-            <w:r>
-              <w:rPr>
-                <w:rFonts w:asciiTheme="minorHAnsi" w:hAnsiTheme="minorHAnsi" w:cstheme="minorHAnsi"/>
-                <w:color w:val="000000" w:themeColor="text1"/>
-                <w:sz w:val="22"/>
-                <w:szCs w:val="22"/>
-              </w:rPr>
-              <w:t>{{ ext</w:t>
-            </w:r>
-            <w:proofErr w:type="gramEnd"/>
-            <w:r>
-              <w:rPr>
-                <w:rFonts w:asciiTheme="minorHAnsi" w:hAnsiTheme="minorHAnsi" w:cstheme="minorHAnsi"/>
-                <w:color w:val="000000" w:themeColor="text1"/>
-                <w:sz w:val="22"/>
-                <w:szCs w:val="22"/>
-              </w:rPr>
-              <w:t>1 }}</w:t>
-            </w:r>
-          </w:p>
-        </w:tc>
-        <w:tc>
-          <w:tcPr>
-            <w:tcW w:w="4438" w:type="dxa"/>
-            <w:vAlign w:val="center"/>
-          </w:tcPr>
-          <w:p>
-            <w:pPr>
-              <w:pStyle w:val="Default"/>
-              <w:spacing w:line="360" w:lineRule="auto"/>
-              <w:jc w:val="center"/>
-              <w:rPr>
-                <w:rFonts w:asciiTheme="minorHAnsi" w:hAnsiTheme="minorHAnsi" w:cstheme="minorHAnsi"/>
-                <w:color w:val="000000" w:themeColor="text1"/>
-                <w:sz w:val="22"/>
-                <w:szCs w:val="22"/>
-              </w:rPr>
-            </w:pPr>
-            <w:proofErr w:type="gramStart"/>
-            <w:r>
-              <w:rPr>
-                <w:rFonts w:asciiTheme="minorHAnsi" w:hAnsiTheme="minorHAnsi" w:cstheme="minorHAnsi"/>
-                <w:color w:val="000000" w:themeColor="text1"/>
-                <w:sz w:val="22"/>
-                <w:szCs w:val="22"/>
-              </w:rPr>
-              <w:t>{{ ext</w:t>
-            </w:r>
-            <w:proofErr w:type="gramEnd"/>
-            <w:r>
-              <w:rPr>
-                <w:rFonts w:asciiTheme="minorHAnsi" w:hAnsiTheme="minorHAnsi" w:cstheme="minorHAnsi"/>
-                <w:color w:val="000000" w:themeColor="text1"/>
-                <w:sz w:val="22"/>
-                <w:szCs w:val="22"/>
-              </w:rPr>
-              <w:t>3</w:t>
-            </w:r>
-            <w:r>
-              <w:rPr>
-                <w:rFonts w:asciiTheme="minorHAnsi" w:hAnsiTheme="minorHAnsi" w:cstheme="minorHAnsi"/>
-                <w:color w:val="000000" w:themeColor="text1"/>
-                <w:sz w:val="22"/>
-                <w:szCs w:val="22"/>
-              </w:rPr>
-              <w:t xml:space="preserve"> }}</w:t>
-            </w:r>
-          </w:p>
-        </w:tc>
-      </w:tr>
-      <w:tr>
-        <w:trPr>
-          <w:trHeight w:val="4407"/>
-        </w:trPr>
-        <w:tc>
-          <w:tcPr>
-            <w:tcW w:w="4395" w:type="dxa"/>
-            <w:vAlign w:val="center"/>
-          </w:tcPr>
-          <w:p>
-            <w:pPr>
-              <w:pStyle w:val="Default"/>
-              <w:spacing w:line="360" w:lineRule="auto"/>
-              <w:rPr>
-                <w:rFonts w:asciiTheme="minorHAnsi" w:hAnsiTheme="minorHAnsi" w:cstheme="minorHAnsi"/>
-                <w:color w:val="000000" w:themeColor="text1"/>
-                <w:sz w:val="22"/>
-                <w:szCs w:val="22"/>
-              </w:rPr>
-            </w:pPr>
-            <w:r>
-              <w:rPr>
-                <w:rFonts w:asciiTheme="minorHAnsi" w:hAnsiTheme="minorHAnsi" w:cstheme="minorHAnsi"/>
-                <w:color w:val="000000" w:themeColor="text1"/>
-                <w:sz w:val="22"/>
-                <w:szCs w:val="22"/>
-              </w:rPr>
-              <w:t>Cuenta con mantenimiento a techo, lozas y azotea debe registrarse en bitácora, dando evidencia de limpieza en bajadas pluviales, aplicación de impermeabilizante, mantenimiento preventivo y correctivo</w:t>
-            </w:r>
-            <w:r>
-              <w:rPr>
-                <w:rFonts w:asciiTheme="minorHAnsi" w:hAnsiTheme="minorHAnsi" w:cstheme="minorHAnsi"/>
-                <w:noProof/>
-                <w:color w:val="000000" w:themeColor="text1"/>
-                <w:sz w:val="22"/>
-                <w:szCs w:val="22"/>
-                <w:lang w:eastAsia="es-MX"/>
-              </w:rPr>
-              <w:t>.  En techo cuenta con iluminación tipo LED y ahorradores de energía.</w:t>
-            </w:r>
-          </w:p>
-        </w:tc>
-        <w:tc>
-          <w:tcPr>
-            <w:tcW w:w="4438" w:type="dxa"/>
-            <w:vAlign w:val="center"/>
-          </w:tcPr>
-          <w:p>
-            <w:pPr>
-              <w:pStyle w:val="Default"/>
-              <w:spacing w:line="360" w:lineRule="auto"/>
-              <w:jc w:val="center"/>
-              <w:rPr>
-                <w:rFonts w:asciiTheme="minorHAnsi" w:hAnsiTheme="minorHAnsi" w:cstheme="minorHAnsi"/>
-                <w:color w:val="000000" w:themeColor="text1"/>
-                <w:sz w:val="22"/>
-                <w:szCs w:val="22"/>
-              </w:rPr>
-            </w:pPr>
-            <w:proofErr w:type="gramStart"/>
-            <w:r>
-              <w:rPr>
-                <w:rFonts w:asciiTheme="minorHAnsi" w:hAnsiTheme="minorHAnsi" w:cstheme="minorHAnsi"/>
-                <w:color w:val="000000" w:themeColor="text1"/>
-                <w:sz w:val="22"/>
-                <w:szCs w:val="22"/>
-              </w:rPr>
-              <w:t>{{ techo</w:t>
-            </w:r>
-            <w:proofErr w:type="gramEnd"/>
-            <w:r>
-              <w:rPr>
-                <w:rFonts w:asciiTheme="minorHAnsi" w:hAnsiTheme="minorHAnsi" w:cstheme="minorHAnsi"/>
-                <w:color w:val="000000" w:themeColor="text1"/>
-                <w:sz w:val="22"/>
-                <w:szCs w:val="22"/>
-              </w:rPr>
-              <w:t xml:space="preserve"> }}</w:t>
-            </w:r>
-          </w:p>
-        </w:tc>
-      </w:tr>
-      <w:tr>
-        <w:trPr>
-          <w:trHeight w:val="668"/>
-        </w:trPr>
-        <w:tc>
-          <w:tcPr>
-            <w:tcW w:w="8833" w:type="dxa"/>
-            <w:gridSpan w:val="2"/>
-            <w:vAlign w:val="center"/>
+            <w:gridSpan w:val="4"/>
           </w:tcPr>
           <w:p>
             <w:pPr>
@@ -774,132 +929,13 @@
                 <w:sz w:val="22"/>
                 <w:szCs w:val="22"/>
               </w:rPr>
-              <w:t>No cuenta con instalaci</w:t>
+              <w:t xml:space="preserve">Se cuenta con un plan de emergencia para casos de incendio, definido en el presente Programa interno de Protección civil, mismo que debe ser difundido y socializado con el personal de </w:t>
             </w:r>
             <w:r>
               <w:rPr>
                 <w:rFonts w:asciiTheme="minorHAnsi" w:hAnsiTheme="minorHAnsi" w:cstheme="minorHAnsi"/>
-                <w:color w:val="000000" w:themeColor="text1"/>
-                <w:sz w:val="22"/>
-                <w:szCs w:val="22"/>
-              </w:rPr>
-              <w:t>ón</w:t>
-            </w:r>
-            <w:r>
-              <w:rPr>
-                <w:rFonts w:asciiTheme="minorHAnsi" w:hAnsiTheme="minorHAnsi" w:cstheme="minorHAnsi"/>
-                <w:color w:val="000000" w:themeColor="text1"/>
-                <w:sz w:val="22"/>
-                <w:szCs w:val="22"/>
-              </w:rPr>
-              <w:t xml:space="preserve"> de gas LP.</w:t>
-            </w:r>
-          </w:p>
-        </w:tc>
-      </w:tr>
-    </w:tbl>
-    <w:p>
-      <w:pPr>
-        <w:pStyle w:val="Default"/>
-        <w:spacing w:after="144" w:line="360" w:lineRule="auto"/>
-        <w:jc w:val="both"/>
-        <w:rPr>
-          <w:rFonts w:asciiTheme="minorHAnsi" w:eastAsia="Times New Roman" w:hAnsiTheme="minorHAnsi" w:cstheme="minorHAnsi"/>
-          <w:snapToGrid w:val="0"/>
-          <w:color w:val="000000" w:themeColor="text1"/>
-          <w:w w:val="0"/>
-          <w:sz w:val="22"/>
-          <w:szCs w:val="22"/>
-          <w:u w:color="000000"/>
-          <w:bdr w:val="none" w:sz="0" w:space="0" w:color="000000"/>
-          <w:shd w:val="clear" w:color="000000" w:fill="000000"/>
-          <w:lang w:eastAsia="x-none" w:bidi="x-none"/>
-        </w:rPr>
-      </w:pPr>
-    </w:p>
-    <w:p>
-      <w:pPr>
-        <w:rPr>
-          <w:rFonts w:cstheme="minorHAnsi"/>
-          <w:color w:val="000000" w:themeColor="text1"/>
-          <w:kern w:val="0"/>
-          <w14:ligatures w14:val="none"/>
-        </w:rPr>
-      </w:pPr>
-      <w:r>
-        <w:rPr>
-          <w:rFonts w:cstheme="minorHAnsi"/>
-          <w:color w:val="000000" w:themeColor="text1"/>
-        </w:rPr>
-        <w:br w:type="page"/>
-      </w:r>
-    </w:p>
-    <w:p>
-      <w:pPr>
-        <w:pStyle w:val="Default"/>
-        <w:spacing w:line="360" w:lineRule="auto"/>
-        <w:ind w:left="720" w:right="2034"/>
-        <w:jc w:val="both"/>
-        <w:rPr>
-          <w:rFonts w:asciiTheme="minorHAnsi" w:hAnsiTheme="minorHAnsi" w:cstheme="minorHAnsi"/>
-          <w:color w:val="000000" w:themeColor="text1"/>
-          <w:sz w:val="22"/>
-          <w:szCs w:val="22"/>
-        </w:rPr>
-      </w:pPr>
-    </w:p>
-    <w:tbl>
-      <w:tblPr>
-        <w:tblStyle w:val="Tablaconcuadrcula"/>
-        <w:tblW w:w="0" w:type="auto"/>
-        <w:tblInd w:w="-5" w:type="dxa"/>
-        <w:tblBorders>
-          <w:top w:val="none" w:sz="0" w:space="0" w:color="auto"/>
-          <w:left w:val="none" w:sz="0" w:space="0" w:color="auto"/>
-          <w:bottom w:val="none" w:sz="0" w:space="0" w:color="auto"/>
-          <w:right w:val="none" w:sz="0" w:space="0" w:color="auto"/>
-          <w:insideH w:val="none" w:sz="0" w:space="0" w:color="auto"/>
-          <w:insideV w:val="none" w:sz="0" w:space="0" w:color="auto"/>
-        </w:tblBorders>
-        <w:tblLook w:val="04A0" w:firstRow="1" w:lastRow="0" w:firstColumn="1" w:lastColumn="0" w:noHBand="0" w:noVBand="1"/>
-      </w:tblPr>
-      <w:tblGrid>
-        <w:gridCol w:w="2947"/>
-        <w:gridCol w:w="2948"/>
-        <w:gridCol w:w="2948"/>
-      </w:tblGrid>
-      <w:tr>
-        <w:tc>
-          <w:tcPr>
-            <w:tcW w:w="8833" w:type="dxa"/>
-            <w:gridSpan w:val="3"/>
-          </w:tcPr>
-          <w:p>
-            <w:pPr>
-              <w:pStyle w:val="Default"/>
-              <w:spacing w:line="360" w:lineRule="auto"/>
-              <w:jc w:val="both"/>
-              <w:rPr>
-                <w:rFonts w:asciiTheme="minorHAnsi" w:hAnsiTheme="minorHAnsi" w:cstheme="minorHAnsi"/>
-                <w:color w:val="000000" w:themeColor="text1"/>
-                <w:sz w:val="22"/>
-                <w:szCs w:val="22"/>
-              </w:rPr>
-            </w:pPr>
-            <w:r>
-              <w:rPr>
-                <w:rFonts w:asciiTheme="minorHAnsi" w:hAnsiTheme="minorHAnsi" w:cstheme="minorHAnsi"/>
-                <w:color w:val="000000" w:themeColor="text1"/>
-                <w:sz w:val="22"/>
-                <w:szCs w:val="22"/>
-              </w:rPr>
-              <w:t xml:space="preserve">Se cuenta con un plan de emergencia para casos de incendio, definido en el presente Programa interno de Protección civil, mismo que debe ser difundido y socializado con el personal de </w:t>
-            </w:r>
-            <w:proofErr w:type="gramStart"/>
-            <w:r>
-              <w:rPr>
-                <w:rFonts w:asciiTheme="minorHAnsi" w:hAnsiTheme="minorHAnsi" w:cstheme="minorHAnsi"/>
                 <w:b/>
+                <w:bCs/>
                 <w:color w:val="000000" w:themeColor="text1"/>
                 <w:sz w:val="22"/>
                 <w:szCs w:val="22"/>
@@ -911,22 +947,45 @@
               <w:rPr>
                 <w:rFonts w:asciiTheme="minorHAnsi" w:hAnsiTheme="minorHAnsi" w:cstheme="minorHAnsi"/>
                 <w:b/>
+                <w:bCs/>
                 <w:color w:val="000000" w:themeColor="text1"/>
                 <w:sz w:val="22"/>
                 <w:szCs w:val="22"/>
               </w:rPr>
-              <w:t>nombre</w:t>
+              <w:t>razon_social</w:t>
             </w:r>
-            <w:proofErr w:type="gramEnd"/>
+            <w:proofErr w:type="spellEnd"/>
             <w:r>
               <w:rPr>
                 <w:rFonts w:asciiTheme="minorHAnsi" w:hAnsiTheme="minorHAnsi" w:cstheme="minorHAnsi"/>
                 <w:b/>
+                <w:bCs/>
                 <w:color w:val="000000" w:themeColor="text1"/>
                 <w:sz w:val="22"/>
                 <w:szCs w:val="22"/>
               </w:rPr>
-              <w:t>_comercial</w:t>
+              <w:t xml:space="preserve"> }} </w:t>
+            </w:r>
+            <w:r>
+              <w:rPr>
+                <w:rFonts w:asciiTheme="minorHAnsi" w:hAnsiTheme="minorHAnsi" w:cstheme="minorHAnsi"/>
+                <w:b/>
+                <w:color w:val="000000" w:themeColor="text1"/>
+                <w:sz w:val="22"/>
+                <w:szCs w:val="22"/>
+              </w:rPr>
+              <w:t xml:space="preserve">{{ </w:t>
+            </w:r>
+            <w:proofErr w:type="spellStart"/>
+            <w:r>
+              <w:rPr>
+                <w:rFonts w:asciiTheme="minorHAnsi" w:hAnsiTheme="minorHAnsi" w:cstheme="minorHAnsi"/>
+                <w:b/>
+                <w:color w:val="000000" w:themeColor="text1"/>
+                <w:sz w:val="22"/>
+                <w:szCs w:val="22"/>
+              </w:rPr>
+              <w:t>nombre_comercial</w:t>
             </w:r>
             <w:proofErr w:type="spellEnd"/>
             <w:r>
@@ -955,294 +1014,103 @@
         <w:trPr>
           <w:trHeight w:val="3062"/>
         </w:trPr>
-        <w:sdt>
-          <w:sdtPr>
-            <w:rPr>
-              <w:rFonts w:asciiTheme="minorHAnsi" w:hAnsiTheme="minorHAnsi" w:cstheme="minorHAnsi"/>
-              <w:color w:val="000000" w:themeColor="text1"/>
-              <w:sz w:val="22"/>
-              <w:szCs w:val="22"/>
-            </w:rPr>
-            <w:id w:val="-2119444129"/>
-            <w:showingPlcHdr/>
-            <w:picture/>
-          </w:sdtPr>
-          <w:sdtEndPr/>
-          <w:sdtContent>
-            <w:tc>
-              <w:tcPr>
-                <w:tcW w:w="3428" w:type="dxa"/>
-                <w:vAlign w:val="center"/>
-              </w:tcPr>
-              <w:p>
-                <w:pPr>
-                  <w:pStyle w:val="Default"/>
-                  <w:spacing w:line="360" w:lineRule="auto"/>
-                  <w:ind w:right="2034"/>
-                  <w:jc w:val="center"/>
-                  <w:rPr>
-                    <w:rFonts w:asciiTheme="minorHAnsi" w:hAnsiTheme="minorHAnsi" w:cstheme="minorHAnsi"/>
-                    <w:color w:val="000000" w:themeColor="text1"/>
-                    <w:sz w:val="22"/>
-                    <w:szCs w:val="22"/>
-                  </w:rPr>
-                </w:pPr>
-                <w:r>
-                  <w:rPr>
-                    <w:rFonts w:asciiTheme="minorHAnsi" w:hAnsiTheme="minorHAnsi" w:cstheme="minorHAnsi"/>
-                    <w:noProof/>
-                    <w:color w:val="000000" w:themeColor="text1"/>
-                    <w:sz w:val="22"/>
-                    <w:szCs w:val="22"/>
-                  </w:rPr>
-                  <w:drawing>
-                    <wp:inline distT="0" distB="0" distL="0" distR="0" wp14:anchorId="007F46EF" wp14:editId="2DD0EC9B">
-                      <wp:extent cx="1524000" cy="1524000"/>
-                      <wp:effectExtent l="0" t="0" r="0" b="0"/>
-                      <wp:docPr id="6" name="Imagen 3"/>
-                      <wp:cNvGraphicFramePr>
-                        <a:graphicFrameLocks xmlns:a="http://schemas.openxmlformats.org/drawingml/2006/main" noChangeAspect="1"/>
-                      </wp:cNvGraphicFramePr>
-                      <a:graphic xmlns:a="http://schemas.openxmlformats.org/drawingml/2006/main">
-                        <a:graphicData uri="http://schemas.openxmlformats.org/drawingml/2006/picture">
-                          <pic:pic xmlns:pic="http://schemas.openxmlformats.org/drawingml/2006/picture">
-                            <pic:nvPicPr>
-                              <pic:cNvPr id="0" name="Picture 6"/>
-                              <pic:cNvPicPr>
-                                <a:picLocks noChangeAspect="1" noChangeArrowheads="1"/>
-                              </pic:cNvPicPr>
-                            </pic:nvPicPr>
-                            <pic:blipFill>
-                              <a:blip r:embed="rId8">
-                                <a:extLst>
-                                  <a:ext uri="{28A0092B-C50C-407E-A947-70E740481C1C}">
-                                    <a14:useLocalDpi xmlns:a14="http://schemas.microsoft.com/office/drawing/2010/main" val="0"/>
-                                  </a:ext>
-                                </a:extLst>
-                              </a:blip>
-                              <a:srcRect/>
-                              <a:stretch>
-                                <a:fillRect/>
-                              </a:stretch>
-                            </pic:blipFill>
-                            <pic:spPr bwMode="auto">
-                              <a:xfrm>
-                                <a:off x="0" y="0"/>
-                                <a:ext cx="1524000" cy="1524000"/>
-                              </a:xfrm>
-                              <a:prstGeom prst="rect">
-                                <a:avLst/>
-                              </a:prstGeom>
-                              <a:noFill/>
-                              <a:ln>
-                                <a:noFill/>
-                              </a:ln>
-                            </pic:spPr>
-                          </pic:pic>
-                        </a:graphicData>
-                      </a:graphic>
-                    </wp:inline>
-                  </w:drawing>
-                </w:r>
-              </w:p>
-            </w:tc>
-          </w:sdtContent>
-        </w:sdt>
-        <w:sdt>
-          <w:sdtPr>
-            <w:rPr>
-              <w:rFonts w:asciiTheme="minorHAnsi" w:hAnsiTheme="minorHAnsi" w:cstheme="minorHAnsi"/>
-              <w:color w:val="000000" w:themeColor="text1"/>
-              <w:sz w:val="22"/>
-              <w:szCs w:val="22"/>
-            </w:rPr>
-            <w:id w:val="-1544437031"/>
-            <w:showingPlcHdr/>
-            <w:picture/>
-          </w:sdtPr>
-          <w:sdtEndPr/>
-          <w:sdtContent>
-            <w:tc>
-              <w:tcPr>
-                <w:tcW w:w="2717" w:type="dxa"/>
-                <w:vAlign w:val="center"/>
-              </w:tcPr>
-              <w:p>
-                <w:pPr>
-                  <w:pStyle w:val="Default"/>
-                  <w:spacing w:line="360" w:lineRule="auto"/>
-                  <w:ind w:right="2034"/>
-                  <w:jc w:val="center"/>
-                  <w:rPr>
-                    <w:rFonts w:asciiTheme="minorHAnsi" w:hAnsiTheme="minorHAnsi" w:cstheme="minorHAnsi"/>
-                    <w:color w:val="000000" w:themeColor="text1"/>
-                    <w:sz w:val="22"/>
-                    <w:szCs w:val="22"/>
-                  </w:rPr>
-                </w:pPr>
-                <w:r>
-                  <w:rPr>
-                    <w:rFonts w:asciiTheme="minorHAnsi" w:hAnsiTheme="minorHAnsi" w:cstheme="minorHAnsi"/>
-                    <w:noProof/>
-                    <w:color w:val="000000" w:themeColor="text1"/>
-                    <w:sz w:val="22"/>
-                    <w:szCs w:val="22"/>
-                  </w:rPr>
-                  <w:drawing>
-                    <wp:inline distT="0" distB="0" distL="0" distR="0" wp14:anchorId="4311CF79" wp14:editId="1D514025">
-                      <wp:extent cx="1524000" cy="1524000"/>
-                      <wp:effectExtent l="0" t="0" r="0" b="0"/>
-                      <wp:docPr id="7" name="Imagen 4"/>
-                      <wp:cNvGraphicFramePr>
-                        <a:graphicFrameLocks xmlns:a="http://schemas.openxmlformats.org/drawingml/2006/main" noChangeAspect="1"/>
-                      </wp:cNvGraphicFramePr>
-                      <a:graphic xmlns:a="http://schemas.openxmlformats.org/drawingml/2006/main">
-                        <a:graphicData uri="http://schemas.openxmlformats.org/drawingml/2006/picture">
-                          <pic:pic xmlns:pic="http://schemas.openxmlformats.org/drawingml/2006/picture">
-                            <pic:nvPicPr>
-                              <pic:cNvPr id="0" name="Picture 7"/>
-                              <pic:cNvPicPr>
-                                <a:picLocks noChangeAspect="1" noChangeArrowheads="1"/>
-                              </pic:cNvPicPr>
-                            </pic:nvPicPr>
-                            <pic:blipFill>
-                              <a:blip r:embed="rId8">
-                                <a:extLst>
-                                  <a:ext uri="{28A0092B-C50C-407E-A947-70E740481C1C}">
-                                    <a14:useLocalDpi xmlns:a14="http://schemas.microsoft.com/office/drawing/2010/main" val="0"/>
-                                  </a:ext>
-                                </a:extLst>
-                              </a:blip>
-                              <a:srcRect/>
-                              <a:stretch>
-                                <a:fillRect/>
-                              </a:stretch>
-                            </pic:blipFill>
-                            <pic:spPr bwMode="auto">
-                              <a:xfrm>
-                                <a:off x="0" y="0"/>
-                                <a:ext cx="1524000" cy="1524000"/>
-                              </a:xfrm>
-                              <a:prstGeom prst="rect">
-                                <a:avLst/>
-                              </a:prstGeom>
-                              <a:noFill/>
-                              <a:ln>
-                                <a:noFill/>
-                              </a:ln>
-                            </pic:spPr>
-                          </pic:pic>
-                        </a:graphicData>
-                      </a:graphic>
-                    </wp:inline>
-                  </w:drawing>
-                </w:r>
-              </w:p>
-            </w:tc>
-          </w:sdtContent>
-        </w:sdt>
-        <w:sdt>
-          <w:sdtPr>
-            <w:rPr>
-              <w:rFonts w:asciiTheme="minorHAnsi" w:hAnsiTheme="minorHAnsi" w:cstheme="minorHAnsi"/>
-              <w:color w:val="000000" w:themeColor="text1"/>
-              <w:sz w:val="22"/>
-              <w:szCs w:val="22"/>
-            </w:rPr>
-            <w:id w:val="880134221"/>
-            <w:showingPlcHdr/>
-            <w:picture/>
-          </w:sdtPr>
-          <w:sdtEndPr/>
-          <w:sdtContent>
-            <w:tc>
-              <w:tcPr>
-                <w:tcW w:w="2688" w:type="dxa"/>
-                <w:vAlign w:val="center"/>
-              </w:tcPr>
-              <w:p>
-                <w:pPr>
-                  <w:pStyle w:val="Default"/>
-                  <w:spacing w:line="360" w:lineRule="auto"/>
-                  <w:ind w:right="2034"/>
-                  <w:jc w:val="center"/>
-                  <w:rPr>
-                    <w:rFonts w:asciiTheme="minorHAnsi" w:hAnsiTheme="minorHAnsi" w:cstheme="minorHAnsi"/>
-                    <w:color w:val="000000" w:themeColor="text1"/>
-                    <w:sz w:val="22"/>
-                    <w:szCs w:val="22"/>
-                  </w:rPr>
-                </w:pPr>
-                <w:r>
-                  <w:rPr>
-                    <w:rFonts w:asciiTheme="minorHAnsi" w:hAnsiTheme="minorHAnsi" w:cstheme="minorHAnsi"/>
-                    <w:noProof/>
-                    <w:color w:val="000000" w:themeColor="text1"/>
-                    <w:sz w:val="22"/>
-                    <w:szCs w:val="22"/>
-                  </w:rPr>
-                  <w:drawing>
-                    <wp:inline distT="0" distB="0" distL="0" distR="0" wp14:anchorId="51168BE1" wp14:editId="690118AB">
-                      <wp:extent cx="1524000" cy="1524000"/>
-                      <wp:effectExtent l="0" t="0" r="0" b="0"/>
-                      <wp:docPr id="8" name="Imagen 5"/>
-                      <wp:cNvGraphicFramePr>
-                        <a:graphicFrameLocks xmlns:a="http://schemas.openxmlformats.org/drawingml/2006/main" noChangeAspect="1"/>
-                      </wp:cNvGraphicFramePr>
-                      <a:graphic xmlns:a="http://schemas.openxmlformats.org/drawingml/2006/main">
-                        <a:graphicData uri="http://schemas.openxmlformats.org/drawingml/2006/picture">
-                          <pic:pic xmlns:pic="http://schemas.openxmlformats.org/drawingml/2006/picture">
-                            <pic:nvPicPr>
-                              <pic:cNvPr id="0" name="Picture 8"/>
-                              <pic:cNvPicPr>
-                                <a:picLocks noChangeAspect="1" noChangeArrowheads="1"/>
-                              </pic:cNvPicPr>
-                            </pic:nvPicPr>
-                            <pic:blipFill>
-                              <a:blip r:embed="rId8">
-                                <a:extLst>
-                                  <a:ext uri="{28A0092B-C50C-407E-A947-70E740481C1C}">
-                                    <a14:useLocalDpi xmlns:a14="http://schemas.microsoft.com/office/drawing/2010/main" val="0"/>
-                                  </a:ext>
-                                </a:extLst>
-                              </a:blip>
-                              <a:srcRect/>
-                              <a:stretch>
-                                <a:fillRect/>
-                              </a:stretch>
-                            </pic:blipFill>
-                            <pic:spPr bwMode="auto">
-                              <a:xfrm>
-                                <a:off x="0" y="0"/>
-                                <a:ext cx="1524000" cy="1524000"/>
-                              </a:xfrm>
-                              <a:prstGeom prst="rect">
-                                <a:avLst/>
-                              </a:prstGeom>
-                              <a:noFill/>
-                              <a:ln>
-                                <a:noFill/>
-                              </a:ln>
-                            </pic:spPr>
-                          </pic:pic>
-                        </a:graphicData>
-                      </a:graphic>
-                    </wp:inline>
-                  </w:drawing>
-                </w:r>
-              </w:p>
-            </w:tc>
-          </w:sdtContent>
-        </w:sdt>
+        <w:tc>
+          <w:tcPr>
+            <w:tcW w:w="2977" w:type="dxa"/>
+            <w:vAlign w:val="center"/>
+          </w:tcPr>
+          <w:p>
+            <w:pPr>
+              <w:pStyle w:val="Default"/>
+              <w:spacing w:line="360" w:lineRule="auto"/>
+              <w:ind w:right="-110"/>
+              <w:jc w:val="center"/>
+              <w:rPr>
+                <w:rFonts w:asciiTheme="minorHAnsi" w:hAnsiTheme="minorHAnsi" w:cstheme="minorHAnsi"/>
+                <w:color w:val="000000" w:themeColor="text1"/>
+                <w:sz w:val="22"/>
+                <w:szCs w:val="22"/>
+              </w:rPr>
+            </w:pPr>
+            <w:r>
+              <w:rPr>
+                <w:rFonts w:asciiTheme="minorHAnsi" w:hAnsiTheme="minorHAnsi" w:cstheme="minorHAnsi"/>
+                <w:color w:val="000000" w:themeColor="text1"/>
+                <w:sz w:val="22"/>
+                <w:szCs w:val="22"/>
+              </w:rPr>
+              <w:t>{{ plan1 }}</w:t>
+            </w:r>
+          </w:p>
+        </w:tc>
+        <w:tc>
+          <w:tcPr>
+            <w:tcW w:w="2717" w:type="dxa"/>
+            <w:vAlign w:val="center"/>
+          </w:tcPr>
+          <w:p>
+            <w:pPr>
+              <w:pStyle w:val="Default"/>
+              <w:spacing w:line="360" w:lineRule="auto"/>
+              <w:ind w:right="-83"/>
+              <w:jc w:val="center"/>
+              <w:rPr>
+                <w:rFonts w:asciiTheme="minorHAnsi" w:hAnsiTheme="minorHAnsi" w:cstheme="minorHAnsi"/>
+                <w:color w:val="000000" w:themeColor="text1"/>
+                <w:sz w:val="22"/>
+                <w:szCs w:val="22"/>
+              </w:rPr>
+            </w:pPr>
+            <w:r>
+              <w:rPr>
+                <w:rFonts w:asciiTheme="minorHAnsi" w:hAnsiTheme="minorHAnsi" w:cstheme="minorHAnsi"/>
+                <w:color w:val="000000" w:themeColor="text1"/>
+                <w:sz w:val="22"/>
+                <w:szCs w:val="22"/>
+              </w:rPr>
+              <w:t>{{ plan2 }}</w:t>
+            </w:r>
+          </w:p>
+        </w:tc>
+        <w:tc>
+          <w:tcPr>
+            <w:tcW w:w="3139" w:type="dxa"/>
+            <w:gridSpan w:val="2"/>
+            <w:vAlign w:val="center"/>
+          </w:tcPr>
+          <w:p>
+            <w:pPr>
+              <w:pStyle w:val="Default"/>
+              <w:spacing w:line="360" w:lineRule="auto"/>
+              <w:ind w:right="-69"/>
+              <w:jc w:val="center"/>
+              <w:rPr>
+                <w:rFonts w:asciiTheme="minorHAnsi" w:hAnsiTheme="minorHAnsi" w:cstheme="minorHAnsi"/>
+                <w:color w:val="000000" w:themeColor="text1"/>
+                <w:sz w:val="22"/>
+                <w:szCs w:val="22"/>
+              </w:rPr>
+            </w:pPr>
+            <w:r>
+              <w:rPr>
+                <w:rFonts w:asciiTheme="minorHAnsi" w:hAnsiTheme="minorHAnsi" w:cstheme="minorHAnsi"/>
+                <w:color w:val="000000" w:themeColor="text1"/>
+                <w:sz w:val="22"/>
+                <w:szCs w:val="22"/>
+              </w:rPr>
+              <w:t>{{ plan3 }}</w:t>
+            </w:r>
+          </w:p>
+        </w:tc>
       </w:tr>
       <w:tr>
         <w:trPr>
-          <w:trHeight w:val="3119"/>
+          <w:trHeight w:val="3288"/>
         </w:trPr>
         <w:tc>
           <w:tcPr>
             <w:tcW w:w="6145" w:type="dxa"/>
-            <w:gridSpan w:val="2"/>
+            <w:gridSpan w:val="3"/>
             <w:vAlign w:val="center"/>
           </w:tcPr>
           <w:p>
@@ -1285,7 +1153,6 @@
                 <w:szCs w:val="22"/>
               </w:rPr>
             </w:pPr>
-            <w:proofErr w:type="gramStart"/>
             <w:r>
               <w:rPr>
                 <w:rFonts w:asciiTheme="minorHAnsi" w:hAnsiTheme="minorHAnsi" w:cstheme="minorHAnsi"/>
@@ -1293,29 +1160,61 @@
                 <w:sz w:val="22"/>
                 <w:szCs w:val="22"/>
               </w:rPr>
-              <w:t>{{ pisos</w:t>
-            </w:r>
-            <w:proofErr w:type="gramEnd"/>
-            <w:r>
-              <w:rPr>
-                <w:rFonts w:asciiTheme="minorHAnsi" w:hAnsiTheme="minorHAnsi" w:cstheme="minorHAnsi"/>
-                <w:color w:val="000000" w:themeColor="text1"/>
-                <w:sz w:val="22"/>
-                <w:szCs w:val="22"/>
-              </w:rPr>
-              <w:t xml:space="preserve"> }}</w:t>
+              <w:t>{{ pisos }}</w:t>
             </w:r>
           </w:p>
         </w:tc>
       </w:tr>
       <w:tr>
         <w:trPr>
-          <w:trHeight w:val="2952"/>
+          <w:trHeight w:val="227"/>
         </w:trPr>
         <w:tc>
           <w:tcPr>
             <w:tcW w:w="6145" w:type="dxa"/>
-            <w:gridSpan w:val="2"/>
+            <w:gridSpan w:val="3"/>
+            <w:vAlign w:val="center"/>
+          </w:tcPr>
+          <w:p>
+            <w:pPr>
+              <w:pStyle w:val="Default"/>
+              <w:ind w:right="-60"/>
+              <w:rPr>
+                <w:rFonts w:asciiTheme="minorHAnsi" w:hAnsiTheme="minorHAnsi" w:cstheme="minorHAnsi"/>
+                <w:color w:val="000000" w:themeColor="text1"/>
+                <w:sz w:val="20"/>
+                <w:szCs w:val="20"/>
+              </w:rPr>
+            </w:pPr>
+          </w:p>
+        </w:tc>
+        <w:tc>
+          <w:tcPr>
+            <w:tcW w:w="2688" w:type="dxa"/>
+            <w:vAlign w:val="center"/>
+          </w:tcPr>
+          <w:p>
+            <w:pPr>
+              <w:pStyle w:val="Default"/>
+              <w:jc w:val="center"/>
+              <w:rPr>
+                <w:rFonts w:asciiTheme="minorHAnsi" w:hAnsiTheme="minorHAnsi" w:cstheme="minorHAnsi"/>
+                <w:color w:val="000000" w:themeColor="text1"/>
+                <w:sz w:val="20"/>
+                <w:szCs w:val="20"/>
+              </w:rPr>
+            </w:pPr>
+          </w:p>
+        </w:tc>
+      </w:tr>
+      <w:tr>
+        <w:trPr>
+          <w:trHeight w:val="3288"/>
+        </w:trPr>
+        <w:tc>
+          <w:tcPr>
+            <w:tcW w:w="6145" w:type="dxa"/>
+            <w:gridSpan w:val="3"/>
             <w:vAlign w:val="center"/>
           </w:tcPr>
           <w:p>
@@ -1377,7 +1276,6 @@
                 <w:szCs w:val="22"/>
               </w:rPr>
             </w:pPr>
-            <w:proofErr w:type="gramStart"/>
             <w:r>
               <w:rPr>
                 <w:rFonts w:asciiTheme="minorHAnsi" w:hAnsiTheme="minorHAnsi" w:cstheme="minorHAnsi"/>
@@ -1398,7 +1296,6 @@
               <w:t>electrico</w:t>
             </w:r>
             <w:proofErr w:type="spellEnd"/>
-            <w:proofErr w:type="gramEnd"/>
             <w:r>
               <w:rPr>
                 <w:rFonts w:asciiTheme="minorHAnsi" w:hAnsiTheme="minorHAnsi" w:cstheme="minorHAnsi"/>
@@ -1414,21 +1311,9 @@
     </w:tbl>
     <w:p>
       <w:pPr>
-        <w:pStyle w:val="Prrafodelista"/>
-        <w:spacing w:line="360" w:lineRule="auto"/>
         <w:rPr>
           <w:rFonts w:cstheme="minorHAnsi"/>
           <w:color w:val="000000" w:themeColor="text1"/>
-        </w:rPr>
-      </w:pPr>
-    </w:p>
-    <w:p>
-      <w:pPr>
-        <w:rPr>
-          <w:rFonts w:cstheme="minorHAnsi"/>
-          <w:color w:val="000000" w:themeColor="text1"/>
-          <w:kern w:val="0"/>
-          <w14:ligatures w14:val="none"/>
         </w:rPr>
       </w:pPr>
       <w:r>
@@ -1441,8 +1326,746 @@
     </w:p>
     <w:p>
       <w:pPr>
-        <w:pStyle w:val="Prrafodelista"/>
+        <w:rPr>
+          <w:rFonts w:cstheme="minorHAnsi"/>
+          <w:color w:val="000000" w:themeColor="text1"/>
+          <w:kern w:val="0"/>
+          <w14:ligatures w14:val="none"/>
+        </w:rPr>
+      </w:pPr>
+    </w:p>
+    <w:tbl>
+      <w:tblPr>
+        <w:tblStyle w:val="Tablaconcuadrcula"/>
+        <w:tblW w:w="0" w:type="auto"/>
+        <w:tblBorders>
+          <w:top w:val="none" w:sz="0" w:space="0" w:color="auto"/>
+          <w:left w:val="none" w:sz="0" w:space="0" w:color="auto"/>
+          <w:bottom w:val="none" w:sz="0" w:space="0" w:color="auto"/>
+          <w:right w:val="none" w:sz="0" w:space="0" w:color="auto"/>
+          <w:insideH w:val="none" w:sz="0" w:space="0" w:color="auto"/>
+          <w:insideV w:val="none" w:sz="0" w:space="0" w:color="auto"/>
+        </w:tblBorders>
+        <w:tblLook w:val="04A0" w:firstRow="1" w:lastRow="0" w:firstColumn="1" w:lastColumn="0" w:noHBand="0" w:noVBand="1"/>
+      </w:tblPr>
+      <w:tblGrid>
+        <w:gridCol w:w="4414"/>
+        <w:gridCol w:w="4414"/>
+      </w:tblGrid>
+      <w:tr>
+        <w:trPr>
+          <w:trHeight w:val="3288"/>
+        </w:trPr>
+        <w:tc>
+          <w:tcPr>
+            <w:tcW w:w="4414" w:type="dxa"/>
+            <w:vAlign w:val="center"/>
+          </w:tcPr>
+          <w:p>
+            <w:pPr>
+              <w:pStyle w:val="Prrafodelista"/>
+              <w:spacing w:line="360" w:lineRule="auto"/>
+              <w:ind w:left="0"/>
+              <w:jc w:val="both"/>
+              <w:rPr>
+                <w:rFonts w:cstheme="minorHAnsi"/>
+                <w:color w:val="000000" w:themeColor="text1"/>
+              </w:rPr>
+            </w:pPr>
+            <w:r>
+              <w:t>Los sanitarios se encuentran higiénicos y sanitizados, con medidas acorde a la población usuarios. Evitar el transvase en productos de limpieza y preferentemente utilizar sustancias con las mismas propiedades químicas, pero menos peligrosas para la salud durante su aseo.</w:t>
+            </w:r>
+          </w:p>
+        </w:tc>
+        <w:tc>
+          <w:tcPr>
+            <w:tcW w:w="4414" w:type="dxa"/>
+            <w:vAlign w:val="center"/>
+          </w:tcPr>
+          <w:p>
+            <w:pPr>
+              <w:pStyle w:val="Prrafodelista"/>
+              <w:spacing w:after="0" w:line="360" w:lineRule="auto"/>
+              <w:ind w:left="0"/>
+              <w:jc w:val="center"/>
+              <w:rPr>
+                <w:rFonts w:cstheme="minorHAnsi"/>
+                <w:color w:val="000000" w:themeColor="text1"/>
+              </w:rPr>
+            </w:pPr>
+            <w:r>
+              <w:t xml:space="preserve">{{ </w:t>
+            </w:r>
+            <w:proofErr w:type="spellStart"/>
+            <w:r>
+              <w:t>banio</w:t>
+            </w:r>
+            <w:proofErr w:type="spellEnd"/>
+            <w:r>
+              <w:t xml:space="preserve"> }}</w:t>
+            </w:r>
+          </w:p>
+        </w:tc>
+      </w:tr>
+      <w:tr>
+        <w:trPr>
+          <w:trHeight w:val="20"/>
+        </w:trPr>
+        <w:tc>
+          <w:tcPr>
+            <w:tcW w:w="4414" w:type="dxa"/>
+            <w:vAlign w:val="center"/>
+          </w:tcPr>
+          <w:p>
+            <w:pPr>
+              <w:pStyle w:val="Prrafodelista"/>
+              <w:spacing w:line="240" w:lineRule="auto"/>
+              <w:ind w:left="0"/>
+              <w:jc w:val="both"/>
+              <w:rPr>
+                <w:rFonts w:cstheme="minorHAnsi"/>
+                <w:noProof/>
+                <w:color w:val="000000" w:themeColor="text1"/>
+                <w:sz w:val="20"/>
+                <w:szCs w:val="20"/>
+                <w:lang w:eastAsia="es-MX"/>
+              </w:rPr>
+            </w:pPr>
+          </w:p>
+        </w:tc>
+        <w:tc>
+          <w:tcPr>
+            <w:tcW w:w="4414" w:type="dxa"/>
+            <w:vAlign w:val="center"/>
+          </w:tcPr>
+          <w:p>
+            <w:pPr>
+              <w:pStyle w:val="Prrafodelista"/>
+              <w:spacing w:after="0" w:line="240" w:lineRule="auto"/>
+              <w:ind w:left="0"/>
+              <w:jc w:val="center"/>
+              <w:rPr>
+                <w:rFonts w:cstheme="minorHAnsi"/>
+                <w:color w:val="000000" w:themeColor="text1"/>
+                <w:sz w:val="20"/>
+                <w:szCs w:val="20"/>
+              </w:rPr>
+            </w:pPr>
+          </w:p>
+        </w:tc>
+      </w:tr>
+      <w:tr>
+        <w:trPr>
+          <w:trHeight w:val="3288"/>
+        </w:trPr>
+        <w:tc>
+          <w:tcPr>
+            <w:tcW w:w="4414" w:type="dxa"/>
+            <w:vAlign w:val="center"/>
+          </w:tcPr>
+          <w:p>
+            <w:pPr>
+              <w:pStyle w:val="Prrafodelista"/>
+              <w:spacing w:line="360" w:lineRule="auto"/>
+              <w:ind w:left="0"/>
+              <w:jc w:val="both"/>
+              <w:rPr>
+                <w:rFonts w:cstheme="minorHAnsi"/>
+                <w:color w:val="000000" w:themeColor="text1"/>
+              </w:rPr>
+            </w:pPr>
+            <w:r>
+              <w:rPr>
+                <w:rFonts w:cstheme="minorHAnsi"/>
+                <w:color w:val="000000" w:themeColor="text1"/>
+              </w:rPr>
+              <w:t xml:space="preserve">El botiquín cuenta con material de curación (NO DEBE CONTENER MEDICAMENTO DE ACUERDO </w:t>
+            </w:r>
+            <w:r>
+              <w:rPr>
+                <w:rFonts w:cstheme="minorHAnsi"/>
+                <w:color w:val="000000" w:themeColor="text1"/>
+              </w:rPr>
+              <w:t>CON</w:t>
+            </w:r>
+            <w:r>
+              <w:rPr>
+                <w:rFonts w:cstheme="minorHAnsi"/>
+                <w:color w:val="000000" w:themeColor="text1"/>
+              </w:rPr>
+              <w:t xml:space="preserve"> LA NOM-030-STPS-2009 Y NOM-020-STPS-1994) debe contar con bitácora de mantenimiento a cargo de la brigada de Primeros auxilios indicación actual.</w:t>
+            </w:r>
+          </w:p>
+        </w:tc>
+        <w:tc>
+          <w:tcPr>
+            <w:tcW w:w="4414" w:type="dxa"/>
+            <w:vAlign w:val="center"/>
+          </w:tcPr>
+          <w:p>
+            <w:pPr>
+              <w:pStyle w:val="Prrafodelista"/>
+              <w:spacing w:after="0" w:line="360" w:lineRule="auto"/>
+              <w:ind w:left="0"/>
+              <w:jc w:val="center"/>
+              <w:rPr>
+                <w:rFonts w:cstheme="minorHAnsi"/>
+                <w:color w:val="000000" w:themeColor="text1"/>
+              </w:rPr>
+            </w:pPr>
+            <w:r>
+              <w:rPr>
+                <w:rFonts w:cstheme="minorHAnsi"/>
+                <w:color w:val="000000" w:themeColor="text1"/>
+              </w:rPr>
+              <w:t xml:space="preserve">{{ </w:t>
+            </w:r>
+            <w:proofErr w:type="spellStart"/>
+            <w:r>
+              <w:rPr>
+                <w:rFonts w:cstheme="minorHAnsi"/>
+                <w:color w:val="000000" w:themeColor="text1"/>
+              </w:rPr>
+              <w:t>botiquin</w:t>
+            </w:r>
+            <w:proofErr w:type="spellEnd"/>
+            <w:r>
+              <w:rPr>
+                <w:rFonts w:cstheme="minorHAnsi"/>
+                <w:color w:val="000000" w:themeColor="text1"/>
+              </w:rPr>
+              <w:t xml:space="preserve"> }}</w:t>
+            </w:r>
+          </w:p>
+        </w:tc>
+      </w:tr>
+      <w:tr>
+        <w:tc>
+          <w:tcPr>
+            <w:tcW w:w="4414" w:type="dxa"/>
+            <w:vAlign w:val="center"/>
+          </w:tcPr>
+          <w:p>
+            <w:pPr>
+              <w:pStyle w:val="Prrafodelista"/>
+              <w:spacing w:line="240" w:lineRule="auto"/>
+              <w:ind w:left="0"/>
+              <w:jc w:val="both"/>
+              <w:rPr>
+                <w:sz w:val="20"/>
+                <w:szCs w:val="20"/>
+              </w:rPr>
+            </w:pPr>
+          </w:p>
+        </w:tc>
+        <w:tc>
+          <w:tcPr>
+            <w:tcW w:w="4414" w:type="dxa"/>
+            <w:vAlign w:val="center"/>
+          </w:tcPr>
+          <w:p>
+            <w:pPr>
+              <w:pStyle w:val="Prrafodelista"/>
+              <w:spacing w:after="0" w:line="240" w:lineRule="auto"/>
+              <w:ind w:left="0"/>
+              <w:jc w:val="center"/>
+              <w:rPr>
+                <w:rFonts w:cstheme="minorHAnsi"/>
+                <w:color w:val="000000" w:themeColor="text1"/>
+                <w:sz w:val="20"/>
+                <w:szCs w:val="20"/>
+              </w:rPr>
+            </w:pPr>
+          </w:p>
+        </w:tc>
+      </w:tr>
+      <w:tr>
+        <w:trPr>
+          <w:trHeight w:val="3288"/>
+        </w:trPr>
+        <w:tc>
+          <w:tcPr>
+            <w:tcW w:w="4414" w:type="dxa"/>
+            <w:vAlign w:val="center"/>
+          </w:tcPr>
+          <w:p>
+            <w:pPr>
+              <w:pStyle w:val="Prrafodelista"/>
+              <w:spacing w:line="360" w:lineRule="auto"/>
+              <w:ind w:left="0"/>
+              <w:jc w:val="both"/>
+              <w:rPr>
+                <w:rFonts w:cstheme="minorHAnsi"/>
+                <w:color w:val="000000" w:themeColor="text1"/>
+              </w:rPr>
+            </w:pPr>
+            <w:r>
+              <w:rPr>
+                <w:rFonts w:cstheme="minorHAnsi"/>
+                <w:color w:val="000000" w:themeColor="text1"/>
+              </w:rPr>
+              <w:t xml:space="preserve">La señalización, se recomienda colocar a una altura de </w:t>
+            </w:r>
+            <w:smartTag w:uri="urn:schemas-microsoft-com:office:smarttags" w:element="metricconverter">
+              <w:smartTagPr>
+                <w:attr w:name="ProductID" w:val="1.50 metros"/>
+              </w:smartTagPr>
+              <w:r>
+                <w:rPr>
+                  <w:rFonts w:cstheme="minorHAnsi"/>
+                  <w:color w:val="000000" w:themeColor="text1"/>
+                </w:rPr>
+                <w:t>1.50 metros</w:t>
+              </w:r>
+            </w:smartTag>
+            <w:r>
+              <w:rPr>
+                <w:rFonts w:cstheme="minorHAnsi"/>
+                <w:color w:val="000000" w:themeColor="text1"/>
+              </w:rPr>
+              <w:t xml:space="preserve"> de acuerdo con NOM 003 SEGOB 2002 Señales y avisos, cuenta en cantidad y calidad óptima de acuerdo con usos de espacios para un mejor desarrollo del plan de evacuación.</w:t>
+            </w:r>
+          </w:p>
+        </w:tc>
+        <w:tc>
+          <w:tcPr>
+            <w:tcW w:w="4414" w:type="dxa"/>
+            <w:vAlign w:val="center"/>
+          </w:tcPr>
+          <w:p>
+            <w:pPr>
+              <w:pStyle w:val="Prrafodelista"/>
+              <w:spacing w:after="0" w:line="360" w:lineRule="auto"/>
+              <w:ind w:left="0"/>
+              <w:jc w:val="center"/>
+              <w:rPr>
+                <w:rFonts w:cstheme="minorHAnsi"/>
+                <w:color w:val="000000" w:themeColor="text1"/>
+              </w:rPr>
+            </w:pPr>
+            <w:r>
+              <w:rPr>
+                <w:rFonts w:cstheme="minorHAnsi"/>
+                <w:color w:val="000000" w:themeColor="text1"/>
+              </w:rPr>
+              <w:t>{{ ruta2 }}</w:t>
+            </w:r>
+          </w:p>
+        </w:tc>
+      </w:tr>
+    </w:tbl>
+    <w:p>
+      <w:pPr>
+        <w:rPr>
+          <w:rFonts w:cstheme="minorHAnsi"/>
+          <w:color w:val="000000" w:themeColor="text1"/>
+        </w:rPr>
+      </w:pPr>
+      <w:r>
+        <w:rPr>
+          <w:rFonts w:cstheme="minorHAnsi"/>
+          <w:color w:val="000000" w:themeColor="text1"/>
+        </w:rPr>
+        <w:br w:type="page"/>
+      </w:r>
+    </w:p>
+    <w:p>
+      <w:pPr>
+        <w:rPr>
+          <w:rFonts w:cstheme="minorHAnsi"/>
+          <w:color w:val="000000" w:themeColor="text1"/>
+          <w:kern w:val="0"/>
+          <w14:ligatures w14:val="none"/>
+        </w:rPr>
+      </w:pPr>
+    </w:p>
+    <w:tbl>
+      <w:tblPr>
+        <w:tblStyle w:val="Tablaconcuadrcula"/>
+        <w:tblW w:w="0" w:type="auto"/>
+        <w:tblBorders>
+          <w:top w:val="none" w:sz="0" w:space="0" w:color="auto"/>
+          <w:left w:val="none" w:sz="0" w:space="0" w:color="auto"/>
+          <w:bottom w:val="none" w:sz="0" w:space="0" w:color="auto"/>
+          <w:right w:val="none" w:sz="0" w:space="0" w:color="auto"/>
+          <w:insideH w:val="none" w:sz="0" w:space="0" w:color="auto"/>
+          <w:insideV w:val="none" w:sz="0" w:space="0" w:color="auto"/>
+        </w:tblBorders>
+        <w:tblLook w:val="04A0" w:firstRow="1" w:lastRow="0" w:firstColumn="1" w:lastColumn="0" w:noHBand="0" w:noVBand="1"/>
+      </w:tblPr>
+      <w:tblGrid>
+        <w:gridCol w:w="4414"/>
+        <w:gridCol w:w="4414"/>
+      </w:tblGrid>
+      <w:tr>
+        <w:trPr>
+          <w:trHeight w:val="3288"/>
+        </w:trPr>
+        <w:tc>
+          <w:tcPr>
+            <w:tcW w:w="4414" w:type="dxa"/>
+            <w:vAlign w:val="center"/>
+          </w:tcPr>
+          <w:p>
+            <w:pPr>
+              <w:pStyle w:val="Prrafodelista"/>
+              <w:spacing w:after="0" w:line="360" w:lineRule="auto"/>
+              <w:ind w:left="0"/>
+              <w:jc w:val="both"/>
+              <w:rPr>
+                <w:rFonts w:cstheme="minorHAnsi"/>
+                <w:color w:val="000000" w:themeColor="text1"/>
+              </w:rPr>
+            </w:pPr>
+            <w:r>
+              <w:rPr>
+                <w:rFonts w:cstheme="minorHAnsi"/>
+                <w:noProof/>
+                <w:color w:val="000000" w:themeColor="text1"/>
+                <w:lang w:eastAsia="es-MX"/>
+              </w:rPr>
+              <w:t>C</w:t>
+            </w:r>
+            <w:r>
+              <w:rPr>
+                <w:rFonts w:cstheme="minorHAnsi"/>
+                <w:noProof/>
+                <w:color w:val="000000" w:themeColor="text1"/>
+                <w:lang w:eastAsia="es-MX"/>
+              </w:rPr>
+              <w:t>uenta</w:t>
+            </w:r>
+            <w:r>
+              <w:rPr>
+                <w:rFonts w:cstheme="minorHAnsi"/>
+                <w:color w:val="000000" w:themeColor="text1"/>
+              </w:rPr>
+              <w:t xml:space="preserve"> con sistema de </w:t>
+            </w:r>
+            <w:r>
+              <w:rPr>
+                <w:rFonts w:cstheme="minorHAnsi"/>
+                <w:b/>
+                <w:color w:val="000000" w:themeColor="text1"/>
+              </w:rPr>
+              <w:t>al</w:t>
+            </w:r>
+            <w:r>
+              <w:rPr>
+                <w:rFonts w:cstheme="minorHAnsi"/>
+                <w:b/>
+                <w:color w:val="000000" w:themeColor="text1"/>
+              </w:rPr>
+              <w:t>a</w:t>
+            </w:r>
+            <w:r>
+              <w:rPr>
+                <w:rFonts w:cstheme="minorHAnsi"/>
+                <w:b/>
+                <w:color w:val="000000" w:themeColor="text1"/>
+              </w:rPr>
+              <w:t>r</w:t>
+            </w:r>
+            <w:r>
+              <w:rPr>
+                <w:rFonts w:cstheme="minorHAnsi"/>
+                <w:b/>
+                <w:color w:val="000000" w:themeColor="text1"/>
+              </w:rPr>
+              <w:t>ma</w:t>
+            </w:r>
+            <w:r>
+              <w:rPr>
+                <w:rFonts w:cstheme="minorHAnsi"/>
+                <w:color w:val="000000" w:themeColor="text1"/>
+              </w:rPr>
+              <w:t xml:space="preserve"> en caso de contingencia, se recomienda </w:t>
+            </w:r>
+            <w:r>
+              <w:rPr>
+                <w:rFonts w:cstheme="minorHAnsi"/>
+                <w:color w:val="000000" w:themeColor="text1"/>
+              </w:rPr>
+              <w:t>realizar inspección de manera regular para garantizar su buen funcionamiento</w:t>
+            </w:r>
+            <w:r>
+              <w:rPr>
+                <w:rFonts w:cstheme="minorHAnsi"/>
+                <w:color w:val="000000" w:themeColor="text1"/>
+              </w:rPr>
+              <w:t>.</w:t>
+            </w:r>
+          </w:p>
+        </w:tc>
+        <w:tc>
+          <w:tcPr>
+            <w:tcW w:w="4414" w:type="dxa"/>
+            <w:vAlign w:val="center"/>
+          </w:tcPr>
+          <w:p>
+            <w:pPr>
+              <w:pStyle w:val="Prrafodelista"/>
+              <w:spacing w:after="0" w:line="360" w:lineRule="auto"/>
+              <w:ind w:left="0"/>
+              <w:jc w:val="center"/>
+              <w:rPr>
+                <w:rFonts w:cstheme="minorHAnsi"/>
+                <w:color w:val="000000" w:themeColor="text1"/>
+              </w:rPr>
+            </w:pPr>
+            <w:r>
+              <w:rPr>
+                <w:rFonts w:cstheme="minorHAnsi"/>
+                <w:color w:val="000000" w:themeColor="text1"/>
+              </w:rPr>
+              <w:t>{{ alarma }}</w:t>
+            </w:r>
+          </w:p>
+        </w:tc>
+      </w:tr>
+      <w:tr>
+        <w:trPr>
+          <w:trHeight w:val="20"/>
+        </w:trPr>
+        <w:tc>
+          <w:tcPr>
+            <w:tcW w:w="4414" w:type="dxa"/>
+            <w:vAlign w:val="center"/>
+          </w:tcPr>
+          <w:p>
+            <w:pPr>
+              <w:pStyle w:val="Prrafodelista"/>
+              <w:spacing w:after="0" w:line="240" w:lineRule="auto"/>
+              <w:ind w:left="0"/>
+              <w:jc w:val="both"/>
+              <w:rPr>
+                <w:rFonts w:cstheme="minorHAnsi"/>
+                <w:color w:val="000000" w:themeColor="text1"/>
+                <w:sz w:val="20"/>
+                <w:szCs w:val="20"/>
+              </w:rPr>
+            </w:pPr>
+          </w:p>
+        </w:tc>
+        <w:tc>
+          <w:tcPr>
+            <w:tcW w:w="4414" w:type="dxa"/>
+            <w:vAlign w:val="center"/>
+          </w:tcPr>
+          <w:p>
+            <w:pPr>
+              <w:pStyle w:val="Prrafodelista"/>
+              <w:spacing w:after="0" w:line="240" w:lineRule="auto"/>
+              <w:ind w:left="0"/>
+              <w:jc w:val="center"/>
+              <w:rPr>
+                <w:rFonts w:cstheme="minorHAnsi"/>
+                <w:color w:val="000000" w:themeColor="text1"/>
+              </w:rPr>
+            </w:pPr>
+          </w:p>
+        </w:tc>
+      </w:tr>
+      <w:tr>
+        <w:trPr>
+          <w:trHeight w:val="3288"/>
+        </w:trPr>
+        <w:tc>
+          <w:tcPr>
+            <w:tcW w:w="4414" w:type="dxa"/>
+            <w:vAlign w:val="center"/>
+          </w:tcPr>
+          <w:p>
+            <w:pPr>
+              <w:pStyle w:val="Prrafodelista"/>
+              <w:spacing w:after="0" w:line="360" w:lineRule="auto"/>
+              <w:ind w:left="0"/>
+              <w:jc w:val="both"/>
+              <w:rPr>
+                <w:rFonts w:cstheme="minorHAnsi"/>
+                <w:color w:val="000000" w:themeColor="text1"/>
+              </w:rPr>
+            </w:pPr>
+            <w:r>
+              <w:t>Cuenta con detectores de humo fotoeléctrico de acuerdo con norma y área de riesgo se encuentran vigentes, se recomienda dar seguimiento al programa de mantenimiento anual.</w:t>
+            </w:r>
+          </w:p>
+        </w:tc>
+        <w:tc>
+          <w:tcPr>
+            <w:tcW w:w="4414" w:type="dxa"/>
+            <w:vAlign w:val="center"/>
+          </w:tcPr>
+          <w:p>
+            <w:pPr>
+              <w:pStyle w:val="Prrafodelista"/>
+              <w:spacing w:after="0" w:line="360" w:lineRule="auto"/>
+              <w:ind w:left="0"/>
+              <w:jc w:val="center"/>
+              <w:rPr>
+                <w:rFonts w:cstheme="minorHAnsi"/>
+                <w:color w:val="000000" w:themeColor="text1"/>
+              </w:rPr>
+            </w:pPr>
+            <w:r>
+              <w:t xml:space="preserve">{{ </w:t>
+            </w:r>
+            <w:proofErr w:type="spellStart"/>
+            <w:r>
+              <w:t>dh</w:t>
+            </w:r>
+            <w:proofErr w:type="spellEnd"/>
+            <w:r>
+              <w:t xml:space="preserve"> }}</w:t>
+            </w:r>
+          </w:p>
+        </w:tc>
+      </w:tr>
+      <w:tr>
+        <w:tc>
+          <w:tcPr>
+            <w:tcW w:w="4414" w:type="dxa"/>
+            <w:vAlign w:val="center"/>
+          </w:tcPr>
+          <w:p>
+            <w:pPr>
+              <w:pStyle w:val="Prrafodelista"/>
+              <w:spacing w:after="0" w:line="240" w:lineRule="auto"/>
+              <w:ind w:left="0"/>
+              <w:jc w:val="both"/>
+              <w:rPr>
+                <w:sz w:val="20"/>
+                <w:szCs w:val="20"/>
+              </w:rPr>
+            </w:pPr>
+          </w:p>
+        </w:tc>
+        <w:tc>
+          <w:tcPr>
+            <w:tcW w:w="4414" w:type="dxa"/>
+            <w:vAlign w:val="center"/>
+          </w:tcPr>
+          <w:p>
+            <w:pPr>
+              <w:pStyle w:val="Prrafodelista"/>
+              <w:spacing w:after="0" w:line="240" w:lineRule="auto"/>
+              <w:ind w:left="0"/>
+              <w:jc w:val="center"/>
+              <w:rPr>
+                <w:sz w:val="20"/>
+                <w:szCs w:val="20"/>
+              </w:rPr>
+            </w:pPr>
+          </w:p>
+        </w:tc>
+      </w:tr>
+      <w:tr>
+        <w:trPr>
+          <w:trHeight w:val="3288"/>
+        </w:trPr>
+        <w:tc>
+          <w:tcPr>
+            <w:tcW w:w="4414" w:type="dxa"/>
+            <w:vAlign w:val="center"/>
+          </w:tcPr>
+          <w:p>
+            <w:pPr>
+              <w:pStyle w:val="Prrafodelista"/>
+              <w:spacing w:after="0" w:line="360" w:lineRule="auto"/>
+              <w:ind w:left="0"/>
+              <w:jc w:val="both"/>
+            </w:pPr>
+            <w:r>
+              <w:t xml:space="preserve">Cuenta con </w:t>
+            </w:r>
+            <w:r>
+              <w:t>lámparas de emergencia</w:t>
+            </w:r>
+            <w:r>
+              <w:t xml:space="preserve"> de acuerdo con norma y área de riesgo se encuentran vigentes, se </w:t>
+            </w:r>
+            <w:r>
+              <w:t>recomienda</w:t>
+            </w:r>
+            <w:r>
+              <w:t xml:space="preserve"> </w:t>
+            </w:r>
+            <w:r>
+              <w:t>dar seguimiento al</w:t>
+            </w:r>
+            <w:r>
+              <w:t xml:space="preserve"> programa de mantenimiento anual.</w:t>
+            </w:r>
+          </w:p>
+        </w:tc>
+        <w:tc>
+          <w:tcPr>
+            <w:tcW w:w="4414" w:type="dxa"/>
+            <w:vAlign w:val="center"/>
+          </w:tcPr>
+          <w:p>
+            <w:pPr>
+              <w:pStyle w:val="Prrafodelista"/>
+              <w:spacing w:after="0" w:line="360" w:lineRule="auto"/>
+              <w:ind w:left="0"/>
+              <w:jc w:val="center"/>
+              <w:rPr>
+                <w:rFonts w:cstheme="minorHAnsi"/>
+                <w:color w:val="000000" w:themeColor="text1"/>
+              </w:rPr>
+            </w:pPr>
+            <w:r>
+              <w:rPr>
+                <w:rFonts w:cstheme="minorHAnsi"/>
+                <w:color w:val="000000" w:themeColor="text1"/>
+              </w:rPr>
+              <w:t xml:space="preserve">{{ </w:t>
+            </w:r>
+            <w:r>
+              <w:rPr>
+                <w:rFonts w:cstheme="minorHAnsi"/>
+                <w:color w:val="000000" w:themeColor="text1"/>
+              </w:rPr>
+              <w:t>lampara</w:t>
+            </w:r>
+            <w:r>
+              <w:rPr>
+                <w:rFonts w:cstheme="minorHAnsi"/>
+                <w:color w:val="000000" w:themeColor="text1"/>
+              </w:rPr>
+              <w:t xml:space="preserve"> }}</w:t>
+            </w:r>
+          </w:p>
+        </w:tc>
+      </w:tr>
+    </w:tbl>
+    <w:p>
+      <w:pPr>
         <w:spacing w:line="360" w:lineRule="auto"/>
+        <w:jc w:val="both"/>
+        <w:rPr>
+          <w:rFonts w:cstheme="minorHAnsi"/>
+          <w:color w:val="000000" w:themeColor="text1"/>
+        </w:rPr>
+      </w:pPr>
+    </w:p>
+    <w:p>
+      <w:pPr>
+        <w:rPr>
+          <w:rFonts w:cstheme="minorHAnsi"/>
+          <w:color w:val="000000" w:themeColor="text1"/>
+        </w:rPr>
+      </w:pPr>
+      <w:r>
+        <w:rPr>
+          <w:rFonts w:cstheme="minorHAnsi"/>
+          <w:color w:val="000000" w:themeColor="text1"/>
+        </w:rPr>
+        <w:br w:type="page"/>
+      </w:r>
+    </w:p>
+    <w:p>
+      <w:pPr>
         <w:rPr>
           <w:rFonts w:cstheme="minorHAnsi"/>
           <w:color w:val="000000" w:themeColor="text1"/>
@@ -1469,7 +2092,7 @@
       </w:tblGrid>
       <w:tr>
         <w:trPr>
-          <w:trHeight w:val="3246"/>
+          <w:trHeight w:val="3288"/>
         </w:trPr>
         <w:tc>
           <w:tcPr>
@@ -1479,8 +2102,9 @@
           <w:p>
             <w:pPr>
               <w:pStyle w:val="Prrafodelista"/>
-              <w:spacing w:line="360" w:lineRule="auto"/>
+              <w:spacing w:after="0" w:line="360" w:lineRule="auto"/>
               <w:ind w:left="0"/>
+              <w:jc w:val="both"/>
               <w:rPr>
                 <w:rFonts w:cstheme="minorHAnsi"/>
                 <w:color w:val="000000" w:themeColor="text1"/>
@@ -1489,11 +2113,9 @@
             <w:r>
               <w:rPr>
                 <w:rFonts w:cstheme="minorHAnsi"/>
-                <w:noProof/>
-                <w:color w:val="000000" w:themeColor="text1"/>
-                <w:lang w:eastAsia="es-MX"/>
-              </w:rPr>
-              <w:t>C</w:t>
+                <w:color w:val="000000" w:themeColor="text1"/>
+              </w:rPr>
+              <w:t>Se recomienda que las instalaciones, se mantengan siempre sin llave hasta el cese de actividades diarias, libres de obstáculos.</w:t>
             </w:r>
             <w:r>
               <w:rPr>
@@ -1502,29 +2124,14 @@
                 <w:color w:val="000000" w:themeColor="text1"/>
                 <w:lang w:eastAsia="es-MX"/>
               </w:rPr>
-              <w:t>uenta</w:t>
+              <w:t xml:space="preserve">  </w:t>
             </w:r>
             <w:r>
               <w:rPr>
                 <w:rFonts w:cstheme="minorHAnsi"/>
                 <w:color w:val="000000" w:themeColor="text1"/>
               </w:rPr>
-              <w:t xml:space="preserve"> con sistema de </w:t>
-            </w:r>
-            <w:r>
-              <w:rPr>
-                <w:rFonts w:cstheme="minorHAnsi"/>
-                <w:b/>
-                <w:color w:val="000000" w:themeColor="text1"/>
-              </w:rPr>
-              <w:t>alertamiento de silbatos</w:t>
-            </w:r>
-            <w:r>
-              <w:rPr>
-                <w:rFonts w:cstheme="minorHAnsi"/>
-                <w:color w:val="000000" w:themeColor="text1"/>
-              </w:rPr>
-              <w:t xml:space="preserve"> en caso de contingencia, se recomienda a corto plazo incluir megáfono con sirena.</w:t>
+              <w:t>Revisar la disposición de objetos no empotrados y que puedan volcarse, plafones que presentan humedad, pueden caer o deslizarse en caso de sismo, ubicados en zona de tránsito peatonal, así como la disposición de pesos en su almacenaje.</w:t>
             </w:r>
           </w:p>
         </w:tc>
@@ -1536,7 +2143,7 @@
           <w:p>
             <w:pPr>
               <w:pStyle w:val="Prrafodelista"/>
-              <w:spacing w:line="360" w:lineRule="auto"/>
+              <w:spacing w:after="0" w:line="360" w:lineRule="auto"/>
               <w:ind w:left="0"/>
               <w:jc w:val="center"/>
               <w:rPr>
@@ -1544,21 +2151,110 @@
                 <w:color w:val="000000" w:themeColor="text1"/>
               </w:rPr>
             </w:pPr>
-            <w:proofErr w:type="gramStart"/>
             <w:r>
               <w:rPr>
                 <w:rFonts w:cstheme="minorHAnsi"/>
                 <w:color w:val="000000" w:themeColor="text1"/>
               </w:rPr>
-              <w:t>{{ alarma</w:t>
+              <w:t>{{ puerta }}</w:t>
             </w:r>
-            <w:proofErr w:type="gramEnd"/>
+          </w:p>
+        </w:tc>
+      </w:tr>
+      <w:tr>
+        <w:trPr>
+          <w:trHeight w:val="20"/>
+        </w:trPr>
+        <w:tc>
+          <w:tcPr>
+            <w:tcW w:w="4414" w:type="dxa"/>
+            <w:vAlign w:val="center"/>
+          </w:tcPr>
+          <w:p>
+            <w:pPr>
+              <w:pStyle w:val="Prrafodelista"/>
+              <w:spacing w:after="0" w:line="240" w:lineRule="auto"/>
+              <w:ind w:left="0"/>
+              <w:jc w:val="both"/>
+              <w:rPr>
+                <w:rFonts w:cstheme="minorHAnsi"/>
+                <w:color w:val="000000" w:themeColor="text1"/>
+                <w:sz w:val="20"/>
+                <w:szCs w:val="20"/>
+              </w:rPr>
+            </w:pPr>
+          </w:p>
+        </w:tc>
+        <w:tc>
+          <w:tcPr>
+            <w:tcW w:w="4414" w:type="dxa"/>
+            <w:vAlign w:val="center"/>
+          </w:tcPr>
+          <w:p>
+            <w:pPr>
+              <w:pStyle w:val="Prrafodelista"/>
+              <w:spacing w:after="0" w:line="240" w:lineRule="auto"/>
+              <w:ind w:left="0"/>
+              <w:jc w:val="center"/>
+              <w:rPr>
+                <w:rFonts w:cstheme="minorHAnsi"/>
+                <w:color w:val="000000" w:themeColor="text1"/>
+              </w:rPr>
+            </w:pPr>
+          </w:p>
+        </w:tc>
+      </w:tr>
+      <w:tr>
+        <w:trPr>
+          <w:trHeight w:val="3288"/>
+        </w:trPr>
+        <w:tc>
+          <w:tcPr>
+            <w:tcW w:w="4414" w:type="dxa"/>
+            <w:vAlign w:val="center"/>
+          </w:tcPr>
+          <w:p>
+            <w:pPr>
+              <w:pStyle w:val="Prrafodelista"/>
+              <w:spacing w:after="0" w:line="360" w:lineRule="auto"/>
+              <w:ind w:left="0"/>
+              <w:jc w:val="both"/>
+              <w:rPr>
+                <w:rFonts w:cstheme="minorHAnsi"/>
+                <w:color w:val="000000" w:themeColor="text1"/>
+              </w:rPr>
+            </w:pPr>
             <w:r>
               <w:rPr>
                 <w:rFonts w:cstheme="minorHAnsi"/>
                 <w:color w:val="000000" w:themeColor="text1"/>
               </w:rPr>
-              <w:t xml:space="preserve"> }}</w:t>
+              <w:t>La estantería se encuentra bien empotrada con material colocado de acuerdo con peso, con bordes romos sin riesgo para los usuarios.</w:t>
+            </w:r>
+          </w:p>
+        </w:tc>
+        <w:tc>
+          <w:tcPr>
+            <w:tcW w:w="4414" w:type="dxa"/>
+            <w:vAlign w:val="center"/>
+          </w:tcPr>
+          <w:p>
+            <w:pPr>
+              <w:pStyle w:val="Prrafodelista"/>
+              <w:spacing w:after="0" w:line="360" w:lineRule="auto"/>
+              <w:ind w:left="0"/>
+              <w:jc w:val="center"/>
+              <w:rPr>
+                <w:rFonts w:cstheme="minorHAnsi"/>
+                <w:color w:val="000000" w:themeColor="text1"/>
+              </w:rPr>
+            </w:pPr>
+            <w:r>
+              <w:rPr>
+                <w:rFonts w:cstheme="minorHAnsi"/>
+                <w:color w:val="000000" w:themeColor="text1"/>
+              </w:rPr>
+              <w:t>{{ estantes }}</w:t>
             </w:r>
           </w:p>
         </w:tc>
@@ -1572,36 +2268,14 @@
           <w:p>
             <w:pPr>
               <w:pStyle w:val="Prrafodelista"/>
-              <w:spacing w:line="360" w:lineRule="auto"/>
+              <w:spacing w:after="0" w:line="240" w:lineRule="auto"/>
               <w:ind w:left="0"/>
-              <w:rPr>
-                <w:rFonts w:cstheme="minorHAnsi"/>
-                <w:color w:val="000000" w:themeColor="text1"/>
+              <w:jc w:val="both"/>
+              <w:rPr>
+                <w:sz w:val="20"/>
+                <w:szCs w:val="20"/>
               </w:rPr>
             </w:pPr>
-            <w:r>
-              <w:rPr>
-                <w:rFonts w:cstheme="minorHAnsi"/>
-                <w:color w:val="000000" w:themeColor="text1"/>
-              </w:rPr>
-              <w:t>Se recomienda que las instalaciones, se mantengan siempre sin llave hasta el cese de actividades diarias, libres de obstáculos.</w:t>
-            </w:r>
-            <w:r>
-              <w:rPr>
-                <w:rFonts w:cstheme="minorHAnsi"/>
-                <w:noProof/>
-                <w:color w:val="000000" w:themeColor="text1"/>
-                <w:lang w:eastAsia="es-MX"/>
-              </w:rPr>
-              <w:t xml:space="preserve">  </w:t>
-            </w:r>
-            <w:r>
-              <w:rPr>
-                <w:rFonts w:cstheme="minorHAnsi"/>
-                <w:color w:val="000000" w:themeColor="text1"/>
-              </w:rPr>
-              <w:t>Revisar la disposición de objetos no empotrados y que puedan volcarse, plafones que presentan humedad, pueden caer o deslizarse en caso de sismo, ubicados en zona de tránsito peatonal, así como la disposición de pesos en su almacenaje.</w:t>
-            </w:r>
           </w:p>
         </w:tc>
         <w:tc>
@@ -1612,173 +2286,20 @@
           <w:p>
             <w:pPr>
               <w:pStyle w:val="Prrafodelista"/>
-              <w:spacing w:line="360" w:lineRule="auto"/>
+              <w:spacing w:after="0" w:line="240" w:lineRule="auto"/>
               <w:ind w:left="0"/>
               <w:jc w:val="center"/>
               <w:rPr>
-                <w:rFonts w:cstheme="minorHAnsi"/>
-                <w:color w:val="000000" w:themeColor="text1"/>
+                <w:sz w:val="20"/>
+                <w:szCs w:val="20"/>
               </w:rPr>
             </w:pPr>
-            <w:proofErr w:type="gramStart"/>
-            <w:r>
-              <w:rPr>
-                <w:rFonts w:cstheme="minorHAnsi"/>
-                <w:color w:val="000000" w:themeColor="text1"/>
-              </w:rPr>
-              <w:t>{{ puerta</w:t>
-            </w:r>
-            <w:proofErr w:type="gramEnd"/>
-            <w:r>
-              <w:rPr>
-                <w:rFonts w:cstheme="minorHAnsi"/>
-                <w:color w:val="000000" w:themeColor="text1"/>
-              </w:rPr>
-              <w:t xml:space="preserve"> }}</w:t>
-            </w:r>
           </w:p>
         </w:tc>
       </w:tr>
       <w:tr>
-        <w:tc>
-          <w:tcPr>
-            <w:tcW w:w="4414" w:type="dxa"/>
-            <w:vAlign w:val="center"/>
-          </w:tcPr>
-          <w:p>
-            <w:pPr>
-              <w:pStyle w:val="Prrafodelista"/>
-              <w:spacing w:line="360" w:lineRule="auto"/>
-              <w:ind w:left="0"/>
-              <w:rPr>
-                <w:rFonts w:cstheme="minorHAnsi"/>
-                <w:color w:val="000000" w:themeColor="text1"/>
-              </w:rPr>
-            </w:pPr>
-            <w:r>
-              <w:rPr>
-                <w:rFonts w:cstheme="minorHAnsi"/>
-                <w:color w:val="000000" w:themeColor="text1"/>
-              </w:rPr>
-              <w:t xml:space="preserve">La señalización, se recomienda colocar a una altura de </w:t>
-            </w:r>
-            <w:smartTag w:uri="urn:schemas-microsoft-com:office:smarttags" w:element="metricconverter">
-              <w:smartTagPr>
-                <w:attr w:name="ProductID" w:val="1.50 metros"/>
-              </w:smartTagPr>
-              <w:r>
-                <w:rPr>
-                  <w:rFonts w:cstheme="minorHAnsi"/>
-                  <w:color w:val="000000" w:themeColor="text1"/>
-                </w:rPr>
-                <w:t>1.50 metros</w:t>
-              </w:r>
-            </w:smartTag>
-            <w:r>
-              <w:rPr>
-                <w:rFonts w:cstheme="minorHAnsi"/>
-                <w:color w:val="000000" w:themeColor="text1"/>
-              </w:rPr>
-              <w:t xml:space="preserve"> de acuerdo con NOM 003 SEGOB 2002 Señales y avisos, cuenta en cantidad y calidad óptima de acuerdo con usos de espacios para un mejor desarrollo del plan de evacuación.</w:t>
-            </w:r>
-          </w:p>
-        </w:tc>
-        <w:tc>
-          <w:tcPr>
-            <w:tcW w:w="4414" w:type="dxa"/>
-            <w:vAlign w:val="center"/>
-          </w:tcPr>
-          <w:p>
-            <w:pPr>
-              <w:pStyle w:val="Prrafodelista"/>
-              <w:spacing w:line="360" w:lineRule="auto"/>
-              <w:ind w:left="0"/>
-              <w:jc w:val="center"/>
-              <w:rPr>
-                <w:rFonts w:cstheme="minorHAnsi"/>
-                <w:color w:val="000000" w:themeColor="text1"/>
-              </w:rPr>
-            </w:pPr>
-            <w:proofErr w:type="gramStart"/>
-            <w:r>
-              <w:rPr>
-                <w:rFonts w:cstheme="minorHAnsi"/>
-                <w:color w:val="000000" w:themeColor="text1"/>
-              </w:rPr>
-              <w:t>{{ ruta</w:t>
-            </w:r>
-            <w:proofErr w:type="gramEnd"/>
-            <w:r>
-              <w:rPr>
-                <w:rFonts w:cstheme="minorHAnsi"/>
-                <w:color w:val="000000" w:themeColor="text1"/>
-              </w:rPr>
-              <w:t>2 }}</w:t>
-            </w:r>
-          </w:p>
-        </w:tc>
-      </w:tr>
-    </w:tbl>
-    <w:p>
-      <w:pPr>
-        <w:pStyle w:val="Prrafodelista"/>
-        <w:spacing w:line="360" w:lineRule="auto"/>
-        <w:jc w:val="both"/>
-        <w:rPr>
-          <w:rFonts w:cstheme="minorHAnsi"/>
-          <w:color w:val="000000" w:themeColor="text1"/>
-        </w:rPr>
-      </w:pPr>
-    </w:p>
-    <w:p>
-      <w:pPr>
-        <w:rPr>
-          <w:rFonts w:cstheme="minorHAnsi"/>
-          <w:color w:val="000000" w:themeColor="text1"/>
-          <w:kern w:val="0"/>
-          <w14:ligatures w14:val="none"/>
-        </w:rPr>
-      </w:pPr>
-      <w:r>
-        <w:rPr>
-          <w:rFonts w:cstheme="minorHAnsi"/>
-          <w:color w:val="000000" w:themeColor="text1"/>
-        </w:rPr>
-        <w:br w:type="page"/>
-      </w:r>
-    </w:p>
-    <w:p>
-      <w:pPr>
-        <w:pStyle w:val="Prrafodelista"/>
-        <w:spacing w:line="360" w:lineRule="auto"/>
-        <w:jc w:val="both"/>
-        <w:rPr>
-          <w:rFonts w:cstheme="minorHAnsi"/>
-          <w:color w:val="000000" w:themeColor="text1"/>
-        </w:rPr>
-      </w:pPr>
-    </w:p>
-    <w:tbl>
-      <w:tblPr>
-        <w:tblStyle w:val="Tablaconcuadrcula"/>
-        <w:tblW w:w="0" w:type="auto"/>
-        <w:tblBorders>
-          <w:top w:val="none" w:sz="0" w:space="0" w:color="auto"/>
-          <w:left w:val="none" w:sz="0" w:space="0" w:color="auto"/>
-          <w:bottom w:val="none" w:sz="0" w:space="0" w:color="auto"/>
-          <w:right w:val="none" w:sz="0" w:space="0" w:color="auto"/>
-          <w:insideH w:val="none" w:sz="0" w:space="0" w:color="auto"/>
-          <w:insideV w:val="none" w:sz="0" w:space="0" w:color="auto"/>
-        </w:tblBorders>
-        <w:tblLook w:val="04A0" w:firstRow="1" w:lastRow="0" w:firstColumn="1" w:lastColumn="0" w:noHBand="0" w:noVBand="1"/>
-      </w:tblPr>
-      <w:tblGrid>
-        <w:gridCol w:w="4414"/>
-        <w:gridCol w:w="4414"/>
-      </w:tblGrid>
-      <w:tr>
         <w:trPr>
-          <w:trHeight w:val="3246"/>
+          <w:trHeight w:val="3288"/>
         </w:trPr>
         <w:tc>
           <w:tcPr>
@@ -1788,274 +2309,15 @@
           <w:p>
             <w:pPr>
               <w:pStyle w:val="Prrafodelista"/>
-              <w:spacing w:line="360" w:lineRule="auto"/>
+              <w:spacing w:after="0" w:line="360" w:lineRule="auto"/>
               <w:ind w:left="0"/>
-              <w:rPr>
-                <w:rFonts w:cstheme="minorHAnsi"/>
-                <w:color w:val="000000" w:themeColor="text1"/>
-              </w:rPr>
+              <w:jc w:val="both"/>
             </w:pPr>
             <w:r>
               <w:rPr>
                 <w:rFonts w:cstheme="minorHAnsi"/>
                 <w:color w:val="000000" w:themeColor="text1"/>
               </w:rPr>
-              <w:t xml:space="preserve">El botiquín cuenta con material de curación (NO DEBE CONTENER MEDICAMENTO DE ACUERDO </w:t>
-            </w:r>
-            <w:r>
-              <w:rPr>
-                <w:rFonts w:cstheme="minorHAnsi"/>
-                <w:color w:val="000000" w:themeColor="text1"/>
-              </w:rPr>
-              <w:t>CON</w:t>
-            </w:r>
-            <w:r>
-              <w:rPr>
-                <w:rFonts w:cstheme="minorHAnsi"/>
-                <w:color w:val="000000" w:themeColor="text1"/>
-              </w:rPr>
-              <w:t xml:space="preserve"> LA NOM-030-STPS-2009 Y NOM-020-STPS-1994) debe contar con bitácora de mantenimiento a cargo de la brigada de Primeros auxilios indicación actual.</w:t>
-            </w:r>
-          </w:p>
-        </w:tc>
-        <w:tc>
-          <w:tcPr>
-            <w:tcW w:w="4414" w:type="dxa"/>
-            <w:vAlign w:val="center"/>
-          </w:tcPr>
-          <w:p>
-            <w:pPr>
-              <w:pStyle w:val="Prrafodelista"/>
-              <w:spacing w:line="360" w:lineRule="auto"/>
-              <w:ind w:left="0"/>
-              <w:jc w:val="center"/>
-              <w:rPr>
-                <w:rFonts w:cstheme="minorHAnsi"/>
-                <w:color w:val="000000" w:themeColor="text1"/>
-              </w:rPr>
-            </w:pPr>
-            <w:proofErr w:type="gramStart"/>
-            <w:r>
-              <w:rPr>
-                <w:rFonts w:cstheme="minorHAnsi"/>
-                <w:color w:val="000000" w:themeColor="text1"/>
-              </w:rPr>
-              <w:t xml:space="preserve">{{ </w:t>
-            </w:r>
-            <w:proofErr w:type="spellStart"/>
-            <w:r>
-              <w:rPr>
-                <w:rFonts w:cstheme="minorHAnsi"/>
-                <w:color w:val="000000" w:themeColor="text1"/>
-              </w:rPr>
-              <w:t>botiquin</w:t>
-            </w:r>
-            <w:proofErr w:type="spellEnd"/>
-            <w:proofErr w:type="gramEnd"/>
-            <w:r>
-              <w:rPr>
-                <w:rFonts w:cstheme="minorHAnsi"/>
-                <w:color w:val="000000" w:themeColor="text1"/>
-              </w:rPr>
-              <w:t xml:space="preserve"> }}</w:t>
-            </w:r>
-          </w:p>
-        </w:tc>
-      </w:tr>
-      <w:tr>
-        <w:tc>
-          <w:tcPr>
-            <w:tcW w:w="4414" w:type="dxa"/>
-            <w:vAlign w:val="center"/>
-          </w:tcPr>
-          <w:p>
-            <w:pPr>
-              <w:pStyle w:val="Prrafodelista"/>
-              <w:spacing w:line="360" w:lineRule="auto"/>
-              <w:ind w:left="0"/>
-              <w:rPr>
-                <w:rFonts w:cstheme="minorHAnsi"/>
-                <w:color w:val="000000" w:themeColor="text1"/>
-              </w:rPr>
-            </w:pPr>
-            <w:r>
-              <w:rPr>
-                <w:rFonts w:cstheme="minorHAnsi"/>
-                <w:color w:val="000000" w:themeColor="text1"/>
-              </w:rPr>
-              <w:t>La estantería se encuentra bien empotrada con material colocado de acuerdo con peso, con bordes romos sin riesgo para los usuarios.</w:t>
-            </w:r>
-          </w:p>
-        </w:tc>
-        <w:tc>
-          <w:tcPr>
-            <w:tcW w:w="4414" w:type="dxa"/>
-            <w:vAlign w:val="center"/>
-          </w:tcPr>
-          <w:p>
-            <w:pPr>
-              <w:pStyle w:val="Prrafodelista"/>
-              <w:spacing w:line="360" w:lineRule="auto"/>
-              <w:ind w:left="0"/>
-              <w:jc w:val="center"/>
-              <w:rPr>
-                <w:rFonts w:cstheme="minorHAnsi"/>
-                <w:color w:val="000000" w:themeColor="text1"/>
-              </w:rPr>
-            </w:pPr>
-            <w:proofErr w:type="gramStart"/>
-            <w:r>
-              <w:rPr>
-                <w:rFonts w:cstheme="minorHAnsi"/>
-                <w:color w:val="000000" w:themeColor="text1"/>
-              </w:rPr>
-              <w:t>{{ estantes</w:t>
-            </w:r>
-            <w:proofErr w:type="gramEnd"/>
-            <w:r>
-              <w:rPr>
-                <w:rFonts w:cstheme="minorHAnsi"/>
-                <w:color w:val="000000" w:themeColor="text1"/>
-              </w:rPr>
-              <w:t xml:space="preserve"> }}</w:t>
-            </w:r>
-          </w:p>
-        </w:tc>
-      </w:tr>
-      <w:tr>
-        <w:tc>
-          <w:tcPr>
-            <w:tcW w:w="4414" w:type="dxa"/>
-            <w:vAlign w:val="center"/>
-          </w:tcPr>
-          <w:p>
-            <w:pPr>
-              <w:pStyle w:val="Prrafodelista"/>
-              <w:spacing w:line="360" w:lineRule="auto"/>
-              <w:ind w:left="0"/>
-              <w:rPr>
-                <w:rFonts w:cstheme="minorHAnsi"/>
-                <w:color w:val="000000" w:themeColor="text1"/>
-              </w:rPr>
-            </w:pPr>
-            <w:r>
-              <w:rPr>
-                <w:rFonts w:cstheme="minorHAnsi"/>
-                <w:color w:val="000000" w:themeColor="text1"/>
-              </w:rPr>
-              <w:t>Los sanitarios se encuentran higiénicos y sanitizados, con medidas acorde a la población usuarios. Evitar el transvase en productos de limpieza y preferentemente utilizar sustancias con las mismas propiedades químicas, pero menos peligrosas para la salud durante su aseo.</w:t>
-            </w:r>
-          </w:p>
-        </w:tc>
-        <w:tc>
-          <w:tcPr>
-            <w:tcW w:w="4414" w:type="dxa"/>
-            <w:vAlign w:val="center"/>
-          </w:tcPr>
-          <w:p>
-            <w:pPr>
-              <w:pStyle w:val="Prrafodelista"/>
-              <w:spacing w:line="360" w:lineRule="auto"/>
-              <w:ind w:left="0"/>
-              <w:jc w:val="center"/>
-              <w:rPr>
-                <w:rFonts w:cstheme="minorHAnsi"/>
-                <w:color w:val="000000" w:themeColor="text1"/>
-              </w:rPr>
-            </w:pPr>
-            <w:proofErr w:type="gramStart"/>
-            <w:r>
-              <w:rPr>
-                <w:rFonts w:cstheme="minorHAnsi"/>
-                <w:color w:val="000000" w:themeColor="text1"/>
-              </w:rPr>
-              <w:t xml:space="preserve">{{ </w:t>
-            </w:r>
-            <w:proofErr w:type="spellStart"/>
-            <w:r>
-              <w:rPr>
-                <w:rFonts w:cstheme="minorHAnsi"/>
-                <w:color w:val="000000" w:themeColor="text1"/>
-              </w:rPr>
-              <w:t>banio</w:t>
-            </w:r>
-            <w:proofErr w:type="spellEnd"/>
-            <w:proofErr w:type="gramEnd"/>
-            <w:r>
-              <w:rPr>
-                <w:rFonts w:cstheme="minorHAnsi"/>
-                <w:color w:val="000000" w:themeColor="text1"/>
-              </w:rPr>
-              <w:t xml:space="preserve"> }}</w:t>
-            </w:r>
-          </w:p>
-        </w:tc>
-      </w:tr>
-    </w:tbl>
-    <w:p>
-      <w:pPr>
-        <w:pStyle w:val="Prrafodelista"/>
-        <w:spacing w:after="0" w:line="360" w:lineRule="auto"/>
-        <w:jc w:val="both"/>
-        <w:rPr>
-          <w:rFonts w:cstheme="minorHAnsi"/>
-          <w:color w:val="000000" w:themeColor="text1"/>
-        </w:rPr>
-      </w:pPr>
-    </w:p>
-    <w:p>
-      <w:pPr>
-        <w:spacing w:after="0" w:line="360" w:lineRule="auto"/>
-        <w:jc w:val="both"/>
-        <w:rPr>
-          <w:rFonts w:cstheme="minorHAnsi"/>
-          <w:color w:val="000000" w:themeColor="text1"/>
-        </w:rPr>
-      </w:pPr>
-    </w:p>
-    <w:tbl>
-      <w:tblPr>
-        <w:tblStyle w:val="Tablaconcuadrcula"/>
-        <w:tblW w:w="0" w:type="auto"/>
-        <w:tblBorders>
-          <w:top w:val="none" w:sz="0" w:space="0" w:color="auto"/>
-          <w:left w:val="none" w:sz="0" w:space="0" w:color="auto"/>
-          <w:bottom w:val="none" w:sz="0" w:space="0" w:color="auto"/>
-          <w:right w:val="none" w:sz="0" w:space="0" w:color="auto"/>
-          <w:insideH w:val="none" w:sz="0" w:space="0" w:color="auto"/>
-          <w:insideV w:val="none" w:sz="0" w:space="0" w:color="auto"/>
-        </w:tblBorders>
-        <w:tblLook w:val="04A0" w:firstRow="1" w:lastRow="0" w:firstColumn="1" w:lastColumn="0" w:noHBand="0" w:noVBand="1"/>
-      </w:tblPr>
-      <w:tblGrid>
-        <w:gridCol w:w="4414"/>
-        <w:gridCol w:w="4414"/>
-      </w:tblGrid>
-      <w:tr>
-        <w:trPr>
-          <w:trHeight w:val="4683"/>
-        </w:trPr>
-        <w:tc>
-          <w:tcPr>
-            <w:tcW w:w="4414" w:type="dxa"/>
-            <w:vAlign w:val="center"/>
-          </w:tcPr>
-          <w:p>
-            <w:pPr>
-              <w:pStyle w:val="Prrafodelista"/>
-              <w:spacing w:line="360" w:lineRule="auto"/>
-              <w:ind w:left="0"/>
-              <w:rPr>
-                <w:rFonts w:cstheme="minorHAnsi"/>
-                <w:color w:val="000000" w:themeColor="text1"/>
-              </w:rPr>
-            </w:pPr>
-            <w:r>
-              <w:rPr>
-                <w:rFonts w:cstheme="minorHAnsi"/>
-                <w:color w:val="000000" w:themeColor="text1"/>
-              </w:rPr>
-              <w:lastRenderedPageBreak/>
               <w:t xml:space="preserve">El site se encuentra restringido en su acceso, limpio de almacenaje de combustibles sólidos y otros, con detector de humo vigente, toda la instalación eléctrica bajo resguardo tubo </w:t>
             </w:r>
             <w:proofErr w:type="spellStart"/>
@@ -2084,7 +2346,7 @@
           <w:p>
             <w:pPr>
               <w:pStyle w:val="Prrafodelista"/>
-              <w:spacing w:line="360" w:lineRule="auto"/>
+              <w:spacing w:after="0" w:line="360" w:lineRule="auto"/>
               <w:ind w:left="0"/>
               <w:jc w:val="center"/>
               <w:rPr>
@@ -2092,84 +2354,12 @@
                 <w:color w:val="000000" w:themeColor="text1"/>
               </w:rPr>
             </w:pPr>
-            <w:proofErr w:type="gramStart"/>
             <w:r>
               <w:rPr>
                 <w:rFonts w:cstheme="minorHAnsi"/>
                 <w:color w:val="000000" w:themeColor="text1"/>
               </w:rPr>
-              <w:t>{{ site</w:t>
-            </w:r>
-            <w:proofErr w:type="gramEnd"/>
-            <w:r>
-              <w:rPr>
-                <w:rFonts w:cstheme="minorHAnsi"/>
-                <w:color w:val="000000" w:themeColor="text1"/>
-              </w:rPr>
-              <w:t xml:space="preserve"> }}</w:t>
-            </w:r>
-          </w:p>
-        </w:tc>
-      </w:tr>
-      <w:tr>
-        <w:trPr>
-          <w:trHeight w:val="5605"/>
-        </w:trPr>
-        <w:tc>
-          <w:tcPr>
-            <w:tcW w:w="4414" w:type="dxa"/>
-            <w:vAlign w:val="center"/>
-          </w:tcPr>
-          <w:p>
-            <w:pPr>
-              <w:pStyle w:val="Prrafodelista"/>
-              <w:spacing w:line="360" w:lineRule="auto"/>
-              <w:ind w:left="0"/>
-              <w:rPr>
-                <w:rFonts w:cstheme="minorHAnsi"/>
-                <w:color w:val="000000" w:themeColor="text1"/>
-              </w:rPr>
-            </w:pPr>
-            <w:r>
-              <w:rPr>
-                <w:rFonts w:cstheme="minorHAnsi"/>
-                <w:color w:val="000000" w:themeColor="text1"/>
-              </w:rPr>
-              <w:t>Cuenta con detectores de humo fotoeléctrico de acuerdo con norma y área de riesgo se encuentran vigentes, se solicita realizar programa de mantenimiento y seguimiento anual.</w:t>
-            </w:r>
-          </w:p>
-        </w:tc>
-        <w:tc>
-          <w:tcPr>
-            <w:tcW w:w="4414" w:type="dxa"/>
-            <w:vAlign w:val="center"/>
-          </w:tcPr>
-          <w:p>
-            <w:pPr>
-              <w:pStyle w:val="Prrafodelista"/>
-              <w:spacing w:line="360" w:lineRule="auto"/>
-              <w:ind w:left="0"/>
-              <w:jc w:val="center"/>
-              <w:rPr>
-                <w:rFonts w:cstheme="minorHAnsi"/>
-                <w:color w:val="000000" w:themeColor="text1"/>
-              </w:rPr>
-            </w:pPr>
-            <w:proofErr w:type="gramStart"/>
-            <w:r>
-              <w:rPr>
-                <w:rFonts w:cstheme="minorHAnsi"/>
-                <w:color w:val="000000" w:themeColor="text1"/>
-              </w:rPr>
-              <w:t>{{ dh</w:t>
-            </w:r>
-            <w:proofErr w:type="gramEnd"/>
-            <w:r>
-              <w:rPr>
-                <w:rFonts w:cstheme="minorHAnsi"/>
-                <w:color w:val="000000" w:themeColor="text1"/>
-              </w:rPr>
-              <w:t xml:space="preserve"> }}</w:t>
+              <w:t>{{ site }}</w:t>
             </w:r>
           </w:p>
         </w:tc>
@@ -2179,11 +2369,19 @@
       <w:pPr>
         <w:rPr>
           <w:rFonts w:cstheme="minorHAnsi"/>
+          <w:color w:val="000000" w:themeColor="text1"/>
+        </w:rPr>
+      </w:pPr>
+    </w:p>
+    <w:p>
+      <w:pPr>
+        <w:rPr>
+          <w:rFonts w:cstheme="minorHAnsi"/>
           <w:color w:val="FFFFFF" w:themeColor="background1"/>
         </w:rPr>
         <w:sectPr>
-          <w:headerReference w:type="default" r:id="rId9"/>
-          <w:footerReference w:type="default" r:id="rId10"/>
+          <w:headerReference w:type="default" r:id="rId8"/>
+          <w:footerReference w:type="default" r:id="rId9"/>
           <w:pgSz w:w="12240" w:h="15840" w:code="1"/>
           <w:pgMar w:top="1417" w:right="1701" w:bottom="1417" w:left="1701" w:header="426" w:footer="920" w:gutter="0"/>
           <w:cols w:space="708"/>
@@ -2208,8 +2406,8 @@
       </w:pPr>
     </w:p>
     <w:sectPr>
-      <w:headerReference w:type="default" r:id="rId11"/>
-      <w:footerReference w:type="default" r:id="rId12"/>
+      <w:headerReference w:type="default" r:id="rId10"/>
+      <w:footerReference w:type="default" r:id="rId11"/>
       <w:type w:val="continuous"/>
       <w:pgSz w:w="12240" w:h="15840" w:code="1"/>
       <w:pgMar w:top="1417" w:right="1701" w:bottom="1417" w:left="1701" w:header="426" w:footer="920" w:gutter="0"/>
@@ -2244,6 +2442,13 @@
       </w:r>
     </w:p>
   </w:endnote>
+  <w:endnote w:type="continuationNotice" w:id="1">
+    <w:p>
+      <w:pPr>
+        <w:spacing w:after="0" w:line="240" w:lineRule="auto"/>
+      </w:pPr>
+    </w:p>
+  </w:endnote>
 </w:endnotes>
 </file>
 
@@ -2262,7 +2467,7 @@
       <mc:AlternateContent>
         <mc:Choice Requires="wps">
           <w:drawing>
-            <wp:anchor distT="45720" distB="45720" distL="114300" distR="114300" simplePos="0" relativeHeight="251662336" behindDoc="0" locked="0" layoutInCell="1" allowOverlap="1" wp14:anchorId="2C3AC754" wp14:editId="65FDB608">
+            <wp:anchor distT="45720" distB="45720" distL="114300" distR="114300" simplePos="0" relativeHeight="251658244" behindDoc="0" locked="0" layoutInCell="1" allowOverlap="1" wp14:anchorId="2C3AC754" wp14:editId="65FDB608">
               <wp:simplePos x="0" y="0"/>
               <wp:positionH relativeFrom="margin">
                 <wp:posOffset>958215</wp:posOffset>
@@ -2351,7 +2556,7 @@
               <v:stroke joinstyle="miter"/>
               <v:path gradientshapeok="t" o:connecttype="rect"/>
             </v:shapetype>
-            <v:shape id="Cuadro de texto 2" o:spid="_x0000_s1026" type="#_x0000_t202" style="position:absolute;left:0;text-align:left;margin-left:75.45pt;margin-top:-1pt;width:290.45pt;height:27.3pt;z-index:251662336;visibility:visible;mso-wrap-style:square;mso-width-percent:0;mso-height-percent:0;mso-wrap-distance-left:9pt;mso-wrap-distance-top:3.6pt;mso-wrap-distance-right:9pt;mso-wrap-distance-bottom:3.6pt;mso-position-horizontal:absolute;mso-position-horizontal-relative:margin;mso-position-vertical:absolute;mso-position-vertical-relative:text;mso-width-percent:0;mso-height-percent:0;mso-width-relative:margin;mso-height-relative:margin;v-text-anchor:top" o:gfxdata="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" stroked="f">
+            <v:shape id="Cuadro de texto 2" o:spid="_x0000_s1026" type="#_x0000_t202" style="position:absolute;left:0;text-align:left;margin-left:75.45pt;margin-top:-1pt;width:290.45pt;height:27.3pt;z-index:251658244;visibility:visible;mso-wrap-style:square;mso-width-percent:0;mso-height-percent:0;mso-wrap-distance-left:9pt;mso-wrap-distance-top:3.6pt;mso-wrap-distance-right:9pt;mso-wrap-distance-bottom:3.6pt;mso-position-horizontal:absolute;mso-position-horizontal-relative:margin;mso-position-vertical:absolute;mso-position-vertical-relative:text;mso-width-percent:0;mso-height-percent:0;mso-width-relative:margin;mso-height-relative:margin;v-text-anchor:top" o:gfxdata="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" stroked="f">
               <v:textbox>
                 <w:txbxContent>
                   <w:p>
@@ -2393,7 +2598,7 @@
         <w:lang w:eastAsia="es-MX"/>
       </w:rPr>
       <w:drawing>
-        <wp:anchor distT="0" distB="0" distL="114300" distR="114300" simplePos="0" relativeHeight="251663360" behindDoc="0" locked="0" layoutInCell="1" allowOverlap="1" wp14:anchorId="513D4CE9" wp14:editId="37BC7816">
+        <wp:anchor distT="0" distB="0" distL="114300" distR="114300" simplePos="0" relativeHeight="251658245" behindDoc="0" locked="0" layoutInCell="1" allowOverlap="1" wp14:anchorId="513D4CE9" wp14:editId="37BC7816">
           <wp:simplePos x="0" y="0"/>
           <wp:positionH relativeFrom="margin">
             <wp:posOffset>-5715</wp:posOffset>
@@ -2507,7 +2712,7 @@
         <w:lang w:eastAsia="es-MX"/>
       </w:rPr>
       <w:drawing>
-        <wp:anchor distT="0" distB="0" distL="114300" distR="114300" simplePos="0" relativeHeight="251657216" behindDoc="1" locked="0" layoutInCell="1" allowOverlap="1" wp14:anchorId="7D56ADE4" wp14:editId="0159F92C">
+        <wp:anchor distT="0" distB="0" distL="114300" distR="114300" simplePos="0" relativeHeight="251658241" behindDoc="1" locked="0" layoutInCell="1" allowOverlap="1" wp14:anchorId="7D56ADE4" wp14:editId="0159F92C">
           <wp:simplePos x="0" y="0"/>
           <wp:positionH relativeFrom="margin">
             <wp:align>center</wp:align>
@@ -2579,7 +2784,7 @@
         <w:lang w:eastAsia="es-MX"/>
       </w:rPr>
       <w:drawing>
-        <wp:anchor distT="0" distB="0" distL="114300" distR="114300" simplePos="0" relativeHeight="251659264" behindDoc="1" locked="0" layoutInCell="1" allowOverlap="1" wp14:anchorId="73B8AB7A" wp14:editId="0E9764C1">
+        <wp:anchor distT="0" distB="0" distL="114300" distR="114300" simplePos="0" relativeHeight="251658242" behindDoc="1" locked="0" layoutInCell="1" allowOverlap="1" wp14:anchorId="73B8AB7A" wp14:editId="0E9764C1">
           <wp:simplePos x="0" y="0"/>
           <wp:positionH relativeFrom="margin">
             <wp:posOffset>4715510</wp:posOffset>
@@ -2649,7 +2854,7 @@
       <mc:AlternateContent>
         <mc:Choice Requires="wps">
           <w:drawing>
-            <wp:anchor distT="0" distB="0" distL="114300" distR="114300" simplePos="0" relativeHeight="251660288" behindDoc="0" locked="0" layoutInCell="1" allowOverlap="1" wp14:anchorId="610101AD" wp14:editId="7EAA2136">
+            <wp:anchor distT="0" distB="0" distL="114300" distR="114300" simplePos="0" relativeHeight="251658243" behindDoc="0" locked="0" layoutInCell="1" allowOverlap="1" wp14:anchorId="610101AD" wp14:editId="7EAA2136">
               <wp:simplePos x="0" y="0"/>
               <wp:positionH relativeFrom="column">
                 <wp:posOffset>2738755</wp:posOffset>
@@ -2758,7 +2963,7 @@
               <v:stroke joinstyle="miter"/>
               <v:path gradientshapeok="t" o:connecttype="rect"/>
             </v:shapetype>
-            <v:shape id="Cuadro de texto 4" o:spid="_x0000_s1027" type="#_x0000_t202" style="position:absolute;margin-left:215.65pt;margin-top:.55pt;width:154.8pt;height:38.4pt;z-index:251660288;visibility:visible;mso-wrap-style:square;mso-width-percent:0;mso-height-percent:0;mso-wrap-distance-left:9pt;mso-wrap-distance-top:0;mso-wrap-distance-right:9pt;mso-wrap-distance-bottom:0;mso-position-horizontal:absolute;mso-position-horizontal-relative:text;mso-position-vertical:absolute;mso-position-vertical-relative:text;mso-width-percent:0;mso-height-percent:0;mso-width-relative:margin;mso-height-relative:margin;v-text-anchor:top" o:gfxdata="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" filled="f" stroked="f" strokeweight=".5pt">
+            <v:shape id="Cuadro de texto 4" o:spid="_x0000_s1027" type="#_x0000_t202" style="position:absolute;margin-left:215.65pt;margin-top:.55pt;width:154.8pt;height:38.4pt;z-index:251658243;visibility:visible;mso-wrap-style:square;mso-width-percent:0;mso-height-percent:0;mso-wrap-distance-left:9pt;mso-wrap-distance-top:0;mso-wrap-distance-right:9pt;mso-wrap-distance-bottom:0;mso-position-horizontal:absolute;mso-position-horizontal-relative:text;mso-position-vertical:absolute;mso-position-vertical-relative:text;mso-width-percent:0;mso-height-percent:0;mso-width-relative:margin;mso-height-relative:margin;v-text-anchor:top" o:gfxdata="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" filled="f" stroked="f" strokeweight=".5pt">
               <v:textbox>
                 <w:txbxContent>
                   <w:p>
@@ -2935,6 +3140,13 @@
       </w:r>
     </w:p>
   </w:footnote>
+  <w:footnote w:type="continuationNotice" w:id="1">
+    <w:p>
+      <w:pPr>
+        <w:spacing w:after="0" w:line="240" w:lineRule="auto"/>
+      </w:pPr>
+    </w:p>
+  </w:footnote>
 </w:footnotes>
 </file>
 
@@ -2967,7 +3179,7 @@
         <w14:ligatures w14:val="none"/>
       </w:rPr>
       <w:drawing>
-        <wp:anchor distT="0" distB="0" distL="114300" distR="114300" simplePos="0" relativeHeight="251665408" behindDoc="0" locked="0" layoutInCell="1" allowOverlap="1" wp14:anchorId="30A6FBA0" wp14:editId="110FF51B">
+        <wp:anchor distT="0" distB="0" distL="114300" distR="114300" simplePos="0" relativeHeight="251658246" behindDoc="0" locked="0" layoutInCell="1" allowOverlap="1" wp14:anchorId="30A6FBA0" wp14:editId="110FF51B">
           <wp:simplePos x="0" y="0"/>
           <wp:positionH relativeFrom="margin">
             <wp:align>left</wp:align>
@@ -3052,7 +3264,6 @@
       </w:rPr>
       <w:t xml:space="preserve">L </w:t>
     </w:r>
-    <w:proofErr w:type="gramStart"/>
     <w:r>
       <w:rPr>
         <w:color w:val="A6A6A6" w:themeColor="background1" w:themeShade="A6"/>
@@ -3075,7 +3286,6 @@
       <w:t>anio</w:t>
     </w:r>
     <w:proofErr w:type="spellEnd"/>
-    <w:proofErr w:type="gramEnd"/>
     <w:r>
       <w:rPr>
         <w:color w:val="A6A6A6" w:themeColor="background1" w:themeShade="A6"/>
@@ -3111,7 +3321,7 @@
         <w:noProof/>
       </w:rPr>
       <w:drawing>
-        <wp:anchor distT="0" distB="0" distL="114300" distR="114300" simplePos="0" relativeHeight="251655168" behindDoc="0" locked="0" layoutInCell="1" allowOverlap="1" wp14:anchorId="5457BDFB" wp14:editId="452025CB">
+        <wp:anchor distT="0" distB="0" distL="114300" distR="114300" simplePos="0" relativeHeight="251658240" behindDoc="0" locked="0" layoutInCell="1" allowOverlap="1" wp14:anchorId="5457BDFB" wp14:editId="452025CB">
           <wp:simplePos x="0" y="0"/>
           <wp:positionH relativeFrom="margin">
             <wp:align>right</wp:align>

</xml_diff>